<commit_message>
Clarify Kodi install steps and repository notes
Update README to use the GitHub Pages repo URL as a Kodi file source (https://minhgi.github.io/repository.seren-nixgate/) and rework install steps to select the repository zip from that source. Note that context.seren installs automatically as a required dependency. Adjust index.html to state the original Seren 3.0.62 is not required when installing via this repository. Binary user guide (Seren_3.3.256_User_Guide.docx) also updated.
</commit_message>
<xml_diff>
--- a/Seren_3.3.256_User_Guide.docx
+++ b/Seren_3.3.256_User_Guide.docx
@@ -2,7 +2,7 @@
 <file path=word/document.xml><?xml version="1.0" encoding="utf-8"?>
 <w:document xmlns:w="http://schemas.openxmlformats.org/wordprocessingml/2006/main" xmlns:m="http://schemas.openxmlformats.org/officeDocument/2006/math" xmlns:r="http://schemas.openxmlformats.org/officeDocument/2006/relationships" xmlns:o="urn:schemas-microsoft-com:office:office" xmlns:v="urn:schemas-microsoft-com:vml" xmlns:w10="urn:schemas-microsoft-com:office:word" xmlns:a="http://schemas.openxmlformats.org/drawingml/2006/main" xmlns:pic="http://schemas.openxmlformats.org/drawingml/2006/picture" xmlns:wp="http://schemas.openxmlformats.org/drawingml/2006/wordprocessingDrawing">
   <w:body>
-    <w:bookmarkStart w:id="185" w:name="Xb9947ee3aaa1fa8eb580a7e0232e49b18a3af20"/>
+    <w:bookmarkStart w:id="186" w:name="Xb9947ee3aaa1fa8eb580a7e0232e49b18a3af20"/>
     <w:p>
       <w:pPr>
         <w:pStyle w:val="Heading1"/>
@@ -3838,7 +3838,7 @@
     </w:p>
     <w:bookmarkEnd w:id="33"/>
     <w:bookmarkEnd w:id="34"/>
-    <w:bookmarkStart w:id="46" w:name="first-time-setup"/>
+    <w:bookmarkStart w:id="47" w:name="first-time-setup"/>
     <w:p>
       <w:pPr>
         <w:pStyle w:val="Heading2"/>
@@ -3862,23 +3862,7 @@
         <w:t xml:space="preserve"> </w:t>
       </w:r>
       <w:r>
-        <w:t xml:space="preserve">This is a personal fork distributed as zip files. Do</w:t>
-      </w:r>
-      <w:r>
-        <w:t xml:space="preserve"> </w:t>
-      </w:r>
-      <w:r>
-        <w:rPr>
-          <w:b/>
-          <w:bCs/>
-        </w:rPr>
-        <w:t xml:space="preserve">not</w:t>
-      </w:r>
-      <w:r>
-        <w:t xml:space="preserve"> </w:t>
-      </w:r>
-      <w:r>
-        <w:t xml:space="preserve">install from any Kodi repository — install each component from zip as described below.</w:t>
+        <w:t xml:space="preserve">This is a personal fork, not available from the official Kodi Add-on repository. Install each component from zip as described below — or see the Seren Nixgate repository alternative after Step 4, which covers the Nixgate fork and context.seren with automatic updates.</w:t>
       </w:r>
     </w:p>
     <w:bookmarkStart w:id="35" w:name="step-1-install-base-seren-3.0.62-first"/>
@@ -4307,7 +4291,188 @@
       </w:r>
     </w:p>
     <w:bookmarkEnd w:id="38"/>
-    <w:bookmarkStart w:id="39" w:name="step-5-connect-a-debrid-service"/>
+    <w:bookmarkStart w:id="39" w:name="Xfae78ede2eea1267236dac95efa50c9fcb738ba"/>
+    <w:p>
+      <w:pPr>
+        <w:pStyle w:val="Heading3"/>
+      </w:pPr>
+      <w:r>
+        <w:t xml:space="preserve">Alternative: Install via the Seren Nixgate Repository (Auto-Updates)</w:t>
+      </w:r>
+    </w:p>
+    <w:p>
+      <w:pPr>
+        <w:pStyle w:val="FirstParagraph"/>
+      </w:pPr>
+      <w:r>
+        <w:t xml:space="preserve">Steps 2 and 4 above (the Nixgate fork and context.seren) can also be installed via a self-hosted Kodi repository instead of manual zip files. Advantage: once the repository add-on is installed, Kodi checks it for updates automatically, so future Seren/context.seren releases won’t require manually re-downloading and reinstalling zips.</w:t>
+      </w:r>
+    </w:p>
+    <w:p>
+      <w:pPr>
+        <w:pStyle w:val="Compact"/>
+        <w:numPr>
+          <w:ilvl w:val="0"/>
+          <w:numId w:val="1012"/>
+        </w:numPr>
+      </w:pPr>
+      <w:r>
+        <w:t xml:space="preserve">In Kodi, go to</w:t>
+      </w:r>
+      <w:r>
+        <w:t xml:space="preserve"> </w:t>
+      </w:r>
+      <w:r>
+        <w:rPr>
+          <w:b/>
+          <w:bCs/>
+        </w:rPr>
+        <w:t xml:space="preserve">Settings → File Manager → Add source</w:t>
+      </w:r>
+      <w:r>
+        <w:t xml:space="preserve">, enter</w:t>
+      </w:r>
+      <w:r>
+        <w:t xml:space="preserve"> </w:t>
+      </w:r>
+      <w:r>
+        <w:rPr>
+          <w:rStyle w:val="VerbatimChar"/>
+        </w:rPr>
+        <w:t xml:space="preserve">https://minhgi.github.io/repository.seren-nixgate/</w:t>
+      </w:r>
+      <w:r>
+        <w:t xml:space="preserve"> </w:t>
+      </w:r>
+      <w:r>
+        <w:t xml:space="preserve">as the path, give it a name (e.g. </w:t>
+      </w:r>
+      <w:r>
+        <w:t xml:space="preserve">“Seren Nixgate”</w:t>
+      </w:r>
+      <w:r>
+        <w:t xml:space="preserve">), and select</w:t>
+      </w:r>
+      <w:r>
+        <w:t xml:space="preserve"> </w:t>
+      </w:r>
+      <w:r>
+        <w:rPr>
+          <w:b/>
+          <w:bCs/>
+        </w:rPr>
+        <w:t xml:space="preserve">OK</w:t>
+      </w:r>
+      <w:r>
+        <w:t xml:space="preserve">.</w:t>
+      </w:r>
+    </w:p>
+    <w:p>
+      <w:pPr>
+        <w:pStyle w:val="Compact"/>
+        <w:numPr>
+          <w:ilvl w:val="0"/>
+          <w:numId w:val="1012"/>
+        </w:numPr>
+      </w:pPr>
+      <w:r>
+        <w:t xml:space="preserve">Go to</w:t>
+      </w:r>
+      <w:r>
+        <w:t xml:space="preserve"> </w:t>
+      </w:r>
+      <w:r>
+        <w:rPr>
+          <w:b/>
+          <w:bCs/>
+        </w:rPr>
+        <w:t xml:space="preserve">Add-ons → Install from zip file</w:t>
+      </w:r>
+      <w:r>
+        <w:t xml:space="preserve"> </w:t>
+      </w:r>
+      <w:r>
+        <w:t xml:space="preserve">→ select the source you just added → select</w:t>
+      </w:r>
+      <w:r>
+        <w:t xml:space="preserve"> </w:t>
+      </w:r>
+      <w:r>
+        <w:rPr>
+          <w:rStyle w:val="VerbatimChar"/>
+        </w:rPr>
+        <w:t xml:space="preserve">repository.seren-nixgate-1.0.0.zip</w:t>
+      </w:r>
+      <w:r>
+        <w:t xml:space="preserve">.</w:t>
+      </w:r>
+    </w:p>
+    <w:p>
+      <w:pPr>
+        <w:pStyle w:val="Compact"/>
+        <w:numPr>
+          <w:ilvl w:val="0"/>
+          <w:numId w:val="1012"/>
+        </w:numPr>
+      </w:pPr>
+      <w:r>
+        <w:t xml:space="preserve">Go to</w:t>
+      </w:r>
+      <w:r>
+        <w:t xml:space="preserve"> </w:t>
+      </w:r>
+      <w:r>
+        <w:rPr>
+          <w:b/>
+          <w:bCs/>
+        </w:rPr>
+        <w:t xml:space="preserve">Add-ons → Install from repository → Seren Nixgate → Video add-ons → Seren</w:t>
+      </w:r>
+      <w:r>
+        <w:t xml:space="preserve">.</w:t>
+      </w:r>
+      <w:r>
+        <w:t xml:space="preserve"> </w:t>
+      </w:r>
+      <w:r>
+        <w:rPr>
+          <w:rStyle w:val="VerbatimChar"/>
+        </w:rPr>
+        <w:t xml:space="preserve">context.seren</w:t>
+      </w:r>
+      <w:r>
+        <w:t xml:space="preserve"> </w:t>
+      </w:r>
+      <w:r>
+        <w:t xml:space="preserve">installs automatically alongside it as a required dependency.</w:t>
+      </w:r>
+    </w:p>
+    <w:p>
+      <w:pPr>
+        <w:pStyle w:val="BlockText"/>
+      </w:pPr>
+      <w:r>
+        <w:t xml:space="preserve">Step 1 (base Seren 3.0.62) is not needed when installing via this repository. If the</w:t>
+      </w:r>
+      <w:r>
+        <w:t xml:space="preserve"> </w:t>
+      </w:r>
+      <w:r>
+        <w:rPr>
+          <w:b/>
+          <w:bCs/>
+        </w:rPr>
+        <w:t xml:space="preserve">Install from repository</w:t>
+      </w:r>
+      <w:r>
+        <w:t xml:space="preserve"> </w:t>
+      </w:r>
+      <w:r>
+        <w:t xml:space="preserve">step above fails or behaves oddly, install Seren 3.0.62 from Kodi’s official Add-on repository first, then retry. Step 3 of the main install flow (a4kScrapers) is unaffected either way, since it always installs through Seren’s own package manager rather than through this repository.</w:t>
+      </w:r>
+    </w:p>
+    <w:bookmarkEnd w:id="39"/>
+    <w:bookmarkStart w:id="40" w:name="step-5-connect-a-debrid-service"/>
     <w:p>
       <w:pPr>
         <w:pStyle w:val="Heading3"/>
@@ -4608,8 +4773,8 @@
         <w:t xml:space="preserve">Each service has: Authorize → Revoke → Status → Account Info buttons in the settings UI.</w:t>
       </w:r>
     </w:p>
-    <w:bookmarkEnd w:id="39"/>
-    <w:bookmarkStart w:id="40" w:name="step-6-connect-trakt-recommended"/>
+    <w:bookmarkEnd w:id="40"/>
+    <w:bookmarkStart w:id="41" w:name="step-6-connect-trakt-recommended"/>
     <w:p>
       <w:pPr>
         <w:pStyle w:val="Heading3"/>
@@ -4661,8 +4826,8 @@
         <w:t xml:space="preserve">, on by default) if you ever want to disable it without revoking your login.</w:t>
       </w:r>
     </w:p>
-    <w:bookmarkEnd w:id="40"/>
-    <w:bookmarkStart w:id="41" w:name="step-7-connect-mdblist-optional"/>
+    <w:bookmarkEnd w:id="41"/>
+    <w:bookmarkStart w:id="42" w:name="step-7-connect-mdblist-optional"/>
     <w:p>
       <w:pPr>
         <w:pStyle w:val="Heading3"/>
@@ -4721,8 +4886,8 @@
         <w:t xml:space="preserve">for the full feature set.</w:t>
       </w:r>
     </w:p>
-    <w:bookmarkEnd w:id="41"/>
-    <w:bookmarkStart w:id="42" w:name="step-8-connect-simkl-optional"/>
+    <w:bookmarkEnd w:id="42"/>
+    <w:bookmarkStart w:id="43" w:name="step-8-connect-simkl-optional"/>
     <w:p>
       <w:pPr>
         <w:pStyle w:val="Heading3"/>
@@ -4810,8 +4975,8 @@
         <w:t xml:space="preserve">for the full feature set.</w:t>
       </w:r>
     </w:p>
-    <w:bookmarkEnd w:id="42"/>
-    <w:bookmarkStart w:id="43" w:name="step-9-set-scraping-timeout"/>
+    <w:bookmarkEnd w:id="43"/>
+    <w:bookmarkStart w:id="44" w:name="step-9-set-scraping-timeout"/>
     <w:p>
       <w:pPr>
         <w:pStyle w:val="Heading3"/>
@@ -4854,8 +5019,8 @@
         <w:t xml:space="preserve">. Increase to 45–60 for slower connections; decrease for faster ones.</w:t>
       </w:r>
     </w:p>
-    <w:bookmarkEnd w:id="43"/>
-    <w:bookmarkStart w:id="44" w:name="Xb90adc83440169fa7be2cd7bfdfaba6f31fdd50"/>
+    <w:bookmarkEnd w:id="44"/>
+    <w:bookmarkStart w:id="45" w:name="Xb90adc83440169fa7be2cd7bfdfaba6f31fdd50"/>
     <w:p>
       <w:pPr>
         <w:pStyle w:val="Heading3"/>
@@ -5013,8 +5178,8 @@
         <w:t xml:space="preserve">. If you are on Kodi 22 with Python 3.14, this specific build is required.</w:t>
       </w:r>
     </w:p>
-    <w:bookmarkEnd w:id="44"/>
-    <w:bookmarkStart w:id="45" w:name="Xa49d4023c2e3d13b2eeb9ec3588ce7243065d99"/>
+    <w:bookmarkEnd w:id="45"/>
+    <w:bookmarkStart w:id="46" w:name="Xa49d4023c2e3d13b2eeb9ec3588ce7243065d99"/>
     <w:p>
       <w:pPr>
         <w:pStyle w:val="Heading3"/>
@@ -5239,9 +5404,9 @@
         </w:pict>
       </w:r>
     </w:p>
-    <w:bookmarkEnd w:id="45"/>
     <w:bookmarkEnd w:id="46"/>
-    <w:bookmarkStart w:id="54" w:name="navigation-menus"/>
+    <w:bookmarkEnd w:id="47"/>
+    <w:bookmarkStart w:id="55" w:name="navigation-menus"/>
     <w:p>
       <w:pPr>
         <w:pStyle w:val="Heading2"/>
@@ -5250,7 +5415,7 @@
         <w:t xml:space="preserve">6. Navigation &amp; Menus</w:t>
       </w:r>
     </w:p>
-    <w:bookmarkStart w:id="47" w:name="home-menu"/>
+    <w:bookmarkStart w:id="48" w:name="home-menu"/>
     <w:p>
       <w:pPr>
         <w:pStyle w:val="Heading3"/>
@@ -5376,8 +5541,8 @@
         <w:t xml:space="preserve">(which includes Debrid Services, Sync Tools, and Clear Cache Tool as submenus).</w:t>
       </w:r>
     </w:p>
-    <w:bookmarkEnd w:id="47"/>
-    <w:bookmarkStart w:id="48" w:name="movies-menus"/>
+    <w:bookmarkEnd w:id="48"/>
+    <w:bookmarkStart w:id="49" w:name="movies-menus"/>
     <w:p>
       <w:pPr>
         <w:pStyle w:val="Heading3"/>
@@ -6196,8 +6361,8 @@
         </w:tc>
       </w:tr>
     </w:tbl>
-    <w:bookmarkEnd w:id="48"/>
-    <w:bookmarkStart w:id="49" w:name="tv-show-menus"/>
+    <w:bookmarkEnd w:id="49"/>
+    <w:bookmarkStart w:id="50" w:name="tv-show-menus"/>
     <w:p>
       <w:pPr>
         <w:pStyle w:val="Heading3"/>
@@ -7084,8 +7249,8 @@
         </w:tc>
       </w:tr>
     </w:tbl>
-    <w:bookmarkEnd w:id="49"/>
-    <w:bookmarkStart w:id="50" w:name="search"/>
+    <w:bookmarkEnd w:id="50"/>
+    <w:bookmarkStart w:id="51" w:name="search"/>
     <w:p>
       <w:pPr>
         <w:pStyle w:val="Heading3"/>
@@ -7118,112 +7283,14 @@
         <w:t xml:space="preserve">is saved per media type and can be cleared individually or all at once.</w:t>
       </w:r>
     </w:p>
-    <w:bookmarkEnd w:id="50"/>
-    <w:bookmarkStart w:id="51" w:name="trakt-lists"/>
+    <w:bookmarkEnd w:id="51"/>
+    <w:bookmarkStart w:id="52" w:name="trakt-lists"/>
     <w:p>
       <w:pPr>
         <w:pStyle w:val="Heading3"/>
       </w:pPr>
       <w:r>
         <w:t xml:space="preserve">Trakt Lists</w:t>
-      </w:r>
-    </w:p>
-    <w:p>
-      <w:pPr>
-        <w:pStyle w:val="Compact"/>
-        <w:numPr>
-          <w:ilvl w:val="0"/>
-          <w:numId w:val="1012"/>
-        </w:numPr>
-      </w:pPr>
-      <w:r>
-        <w:rPr>
-          <w:b/>
-          <w:bCs/>
-        </w:rPr>
-        <w:t xml:space="preserve">My Trakt Lists</w:t>
-      </w:r>
-      <w:r>
-        <w:t xml:space="preserve"> </w:t>
-      </w:r>
-      <w:r>
-        <w:t xml:space="preserve">— your personal Trakt lists</w:t>
-      </w:r>
-    </w:p>
-    <w:p>
-      <w:pPr>
-        <w:pStyle w:val="Compact"/>
-        <w:numPr>
-          <w:ilvl w:val="0"/>
-          <w:numId w:val="1012"/>
-        </w:numPr>
-      </w:pPr>
-      <w:r>
-        <w:rPr>
-          <w:b/>
-          <w:bCs/>
-        </w:rPr>
-        <w:t xml:space="preserve">Liked Lists</w:t>
-      </w:r>
-      <w:r>
-        <w:t xml:space="preserve"> </w:t>
-      </w:r>
-      <w:r>
-        <w:t xml:space="preserve">— lists you’ve liked/followed</w:t>
-      </w:r>
-    </w:p>
-    <w:p>
-      <w:pPr>
-        <w:pStyle w:val="Compact"/>
-        <w:numPr>
-          <w:ilvl w:val="0"/>
-          <w:numId w:val="1012"/>
-        </w:numPr>
-      </w:pPr>
-      <w:r>
-        <w:rPr>
-          <w:b/>
-          <w:bCs/>
-        </w:rPr>
-        <w:t xml:space="preserve">Trending Lists</w:t>
-      </w:r>
-      <w:r>
-        <w:t xml:space="preserve"> </w:t>
-      </w:r>
-      <w:r>
-        <w:t xml:space="preserve">— community trending lists</w:t>
-      </w:r>
-    </w:p>
-    <w:p>
-      <w:pPr>
-        <w:pStyle w:val="Compact"/>
-        <w:numPr>
-          <w:ilvl w:val="0"/>
-          <w:numId w:val="1012"/>
-        </w:numPr>
-      </w:pPr>
-      <w:r>
-        <w:rPr>
-          <w:b/>
-          <w:bCs/>
-        </w:rPr>
-        <w:t xml:space="preserve">Popular Lists</w:t>
-      </w:r>
-      <w:r>
-        <w:t xml:space="preserve"> </w:t>
-      </w:r>
-      <w:r>
-        <w:t xml:space="preserve">— most popular public lists</w:t>
-      </w:r>
-    </w:p>
-    <w:bookmarkEnd w:id="51"/>
-    <w:bookmarkStart w:id="52" w:name="mdblist-lists"/>
-    <w:p>
-      <w:pPr>
-        <w:pStyle w:val="Heading3"/>
-      </w:pPr>
-      <w:r>
-        <w:t xml:space="preserve">MDBList Lists</w:t>
       </w:r>
     </w:p>
     <w:p>
@@ -7239,13 +7306,13 @@
           <w:b/>
           <w:bCs/>
         </w:rPr>
-        <w:t xml:space="preserve">My Movie/Show Lists</w:t>
-      </w:r>
-      <w:r>
-        <w:t xml:space="preserve"> </w:t>
-      </w:r>
-      <w:r>
-        <w:t xml:space="preserve">— your personal MDBList lists (both dynamic Trakt-synced lists and manually-managed static lists)</w:t>
+        <w:t xml:space="preserve">My Trakt Lists</w:t>
+      </w:r>
+      <w:r>
+        <w:t xml:space="preserve"> </w:t>
+      </w:r>
+      <w:r>
+        <w:t xml:space="preserve">— your personal Trakt lists</w:t>
       </w:r>
     </w:p>
     <w:p>
@@ -7254,6 +7321,104 @@
         <w:numPr>
           <w:ilvl w:val="0"/>
           <w:numId w:val="1013"/>
+        </w:numPr>
+      </w:pPr>
+      <w:r>
+        <w:rPr>
+          <w:b/>
+          <w:bCs/>
+        </w:rPr>
+        <w:t xml:space="preserve">Liked Lists</w:t>
+      </w:r>
+      <w:r>
+        <w:t xml:space="preserve"> </w:t>
+      </w:r>
+      <w:r>
+        <w:t xml:space="preserve">— lists you’ve liked/followed</w:t>
+      </w:r>
+    </w:p>
+    <w:p>
+      <w:pPr>
+        <w:pStyle w:val="Compact"/>
+        <w:numPr>
+          <w:ilvl w:val="0"/>
+          <w:numId w:val="1013"/>
+        </w:numPr>
+      </w:pPr>
+      <w:r>
+        <w:rPr>
+          <w:b/>
+          <w:bCs/>
+        </w:rPr>
+        <w:t xml:space="preserve">Trending Lists</w:t>
+      </w:r>
+      <w:r>
+        <w:t xml:space="preserve"> </w:t>
+      </w:r>
+      <w:r>
+        <w:t xml:space="preserve">— community trending lists</w:t>
+      </w:r>
+    </w:p>
+    <w:p>
+      <w:pPr>
+        <w:pStyle w:val="Compact"/>
+        <w:numPr>
+          <w:ilvl w:val="0"/>
+          <w:numId w:val="1013"/>
+        </w:numPr>
+      </w:pPr>
+      <w:r>
+        <w:rPr>
+          <w:b/>
+          <w:bCs/>
+        </w:rPr>
+        <w:t xml:space="preserve">Popular Lists</w:t>
+      </w:r>
+      <w:r>
+        <w:t xml:space="preserve"> </w:t>
+      </w:r>
+      <w:r>
+        <w:t xml:space="preserve">— most popular public lists</w:t>
+      </w:r>
+    </w:p>
+    <w:bookmarkEnd w:id="52"/>
+    <w:bookmarkStart w:id="53" w:name="mdblist-lists"/>
+    <w:p>
+      <w:pPr>
+        <w:pStyle w:val="Heading3"/>
+      </w:pPr>
+      <w:r>
+        <w:t xml:space="preserve">MDBList Lists</w:t>
+      </w:r>
+    </w:p>
+    <w:p>
+      <w:pPr>
+        <w:pStyle w:val="Compact"/>
+        <w:numPr>
+          <w:ilvl w:val="0"/>
+          <w:numId w:val="1014"/>
+        </w:numPr>
+      </w:pPr>
+      <w:r>
+        <w:rPr>
+          <w:b/>
+          <w:bCs/>
+        </w:rPr>
+        <w:t xml:space="preserve">My Movie/Show Lists</w:t>
+      </w:r>
+      <w:r>
+        <w:t xml:space="preserve"> </w:t>
+      </w:r>
+      <w:r>
+        <w:t xml:space="preserve">— your personal MDBList lists (both dynamic Trakt-synced lists and manually-managed static lists)</w:t>
+      </w:r>
+    </w:p>
+    <w:p>
+      <w:pPr>
+        <w:pStyle w:val="Compact"/>
+        <w:numPr>
+          <w:ilvl w:val="0"/>
+          <w:numId w:val="1014"/>
         </w:numPr>
       </w:pPr>
       <w:r>
@@ -7307,8 +7472,8 @@
         <w:t xml:space="preserve">for the full list-management feature set (sort, filter, create, rename, privacy, delete, add/remove items).</w:t>
       </w:r>
     </w:p>
-    <w:bookmarkEnd w:id="52"/>
-    <w:bookmarkStart w:id="53" w:name="simkl"/>
+    <w:bookmarkEnd w:id="53"/>
+    <w:bookmarkStart w:id="54" w:name="simkl"/>
     <w:p>
       <w:pPr>
         <w:pStyle w:val="Heading3"/>
@@ -7346,9 +7511,9 @@
         </w:pict>
       </w:r>
     </w:p>
-    <w:bookmarkEnd w:id="53"/>
     <w:bookmarkEnd w:id="54"/>
-    <w:bookmarkStart w:id="63" w:name="how-scraping-works"/>
+    <w:bookmarkEnd w:id="55"/>
+    <w:bookmarkStart w:id="64" w:name="how-scraping-works"/>
     <w:p>
       <w:pPr>
         <w:pStyle w:val="Heading2"/>
@@ -7365,7 +7530,7 @@
         <w:t xml:space="preserve">When you press Play, Seren goes through the following process:</w:t>
       </w:r>
     </w:p>
-    <w:bookmarkStart w:id="55" w:name="step-1-torrent-cache-lookup-tier-0"/>
+    <w:bookmarkStart w:id="56" w:name="step-1-torrent-cache-lookup-tier-0"/>
     <w:p>
       <w:pPr>
         <w:pStyle w:val="Heading3"/>
@@ -7422,8 +7587,8 @@
         <w:t xml:space="preserve">against your debrid account’s own library — if you’ve previously cached the file, it finds it instantly.</w:t>
       </w:r>
     </w:p>
-    <w:bookmarkEnd w:id="55"/>
-    <w:bookmarkStart w:id="56" w:name="step-2-tiered-scraping"/>
+    <w:bookmarkEnd w:id="56"/>
+    <w:bookmarkStart w:id="57" w:name="step-2-tiered-scraping"/>
     <w:p>
       <w:pPr>
         <w:pStyle w:val="Heading3"/>
@@ -7972,8 +8137,8 @@
         <w:t xml:space="preserve">.</w:t>
       </w:r>
     </w:p>
-    <w:bookmarkEnd w:id="56"/>
-    <w:bookmarkStart w:id="57" w:name="step-3-debrid-cache-check"/>
+    <w:bookmarkEnd w:id="57"/>
+    <w:bookmarkStart w:id="58" w:name="step-3-debrid-cache-check"/>
     <w:p>
       <w:pPr>
         <w:pStyle w:val="Heading3"/>
@@ -8210,8 +8375,8 @@
         </w:tc>
       </w:tr>
     </w:tbl>
-    <w:bookmarkEnd w:id="57"/>
-    <w:bookmarkStart w:id="58" w:name="step-4-source-filtering-sorting"/>
+    <w:bookmarkEnd w:id="58"/>
+    <w:bookmarkStart w:id="59" w:name="step-4-source-filtering-sorting"/>
     <w:p>
       <w:pPr>
         <w:pStyle w:val="Heading3"/>
@@ -8228,8 +8393,8 @@
         <w:t xml:space="preserve">All found sources are filtered by your quality/format preferences, then sorted by priority. The best source is selected automatically (or you can choose manually).</w:t>
       </w:r>
     </w:p>
-    <w:bookmarkEnd w:id="58"/>
-    <w:bookmarkStart w:id="59" w:name="step-5-resolution-playback"/>
+    <w:bookmarkEnd w:id="59"/>
+    <w:bookmarkStart w:id="60" w:name="step-5-resolution-playback"/>
     <w:p>
       <w:pPr>
         <w:pStyle w:val="Heading3"/>
@@ -8246,8 +8411,8 @@
         <w:t xml:space="preserve">The winning source’s torrent hash is sent to your debrid service, which returns a direct CDN streaming URL. Kodi plays this as a standard HTTP stream — no P2P seeding involved.</w:t>
       </w:r>
     </w:p>
-    <w:bookmarkEnd w:id="59"/>
-    <w:bookmarkStart w:id="60" w:name="all-tier-sweep-mode"/>
+    <w:bookmarkEnd w:id="60"/>
+    <w:bookmarkStart w:id="61" w:name="all-tier-sweep-mode"/>
     <w:p>
       <w:pPr>
         <w:pStyle w:val="Heading3"/>
@@ -8316,8 +8481,8 @@
         <w:t xml:space="preserve">is still respected in sweep mode — if enough cached sources are found, the sweep stops early.</w:t>
       </w:r>
     </w:p>
-    <w:bookmarkEnd w:id="60"/>
-    <w:bookmarkStart w:id="61" w:name="background-pre-scrape"/>
+    <w:bookmarkEnd w:id="61"/>
+    <w:bookmarkStart w:id="62" w:name="background-pre-scrape"/>
     <w:p>
       <w:pPr>
         <w:pStyle w:val="Heading3"/>
@@ -8334,8 +8499,8 @@
         <w:t xml:space="preserve">Seren can pre-scrape the next episode in the background while you watch the current one (Smart Play). Results are cached so the next episode starts immediately.</w:t>
       </w:r>
     </w:p>
-    <w:bookmarkEnd w:id="61"/>
-    <w:bookmarkStart w:id="62" w:name="scraping-timeout"/>
+    <w:bookmarkEnd w:id="62"/>
+    <w:bookmarkStart w:id="63" w:name="scraping-timeout"/>
     <w:p>
       <w:pPr>
         <w:pStyle w:val="Heading3"/>
@@ -8372,9 +8537,9 @@
         </w:pict>
       </w:r>
     </w:p>
-    <w:bookmarkEnd w:id="62"/>
     <w:bookmarkEnd w:id="63"/>
-    <w:bookmarkStart w:id="73" w:name="source-filtering-sorting"/>
+    <w:bookmarkEnd w:id="64"/>
+    <w:bookmarkStart w:id="74" w:name="source-filtering-sorting"/>
     <w:p>
       <w:pPr>
         <w:pStyle w:val="Heading2"/>
@@ -8383,7 +8548,7 @@
         <w:t xml:space="preserve">8. Source Filtering &amp; Sorting</w:t>
       </w:r>
     </w:p>
-    <w:bookmarkStart w:id="64" w:name="quality-filters"/>
+    <w:bookmarkStart w:id="65" w:name="quality-filters"/>
     <w:p>
       <w:pPr>
         <w:pStyle w:val="Heading3"/>
@@ -8405,7 +8570,7 @@
         <w:pStyle w:val="Compact"/>
         <w:numPr>
           <w:ilvl w:val="0"/>
-          <w:numId w:val="1014"/>
+          <w:numId w:val="1015"/>
         </w:numPr>
       </w:pPr>
       <w:r>
@@ -8427,7 +8592,7 @@
         <w:pStyle w:val="Compact"/>
         <w:numPr>
           <w:ilvl w:val="0"/>
-          <w:numId w:val="1014"/>
+          <w:numId w:val="1015"/>
         </w:numPr>
       </w:pPr>
       <w:r>
@@ -8443,7 +8608,7 @@
         <w:pStyle w:val="Compact"/>
         <w:numPr>
           <w:ilvl w:val="0"/>
-          <w:numId w:val="1014"/>
+          <w:numId w:val="1015"/>
         </w:numPr>
       </w:pPr>
       <w:r>
@@ -8459,7 +8624,7 @@
         <w:pStyle w:val="Compact"/>
         <w:numPr>
           <w:ilvl w:val="0"/>
-          <w:numId w:val="1014"/>
+          <w:numId w:val="1015"/>
         </w:numPr>
       </w:pPr>
       <w:r>
@@ -8476,8 +8641,8 @@
         <w:t xml:space="preserve">(anything lower)</w:t>
       </w:r>
     </w:p>
-    <w:bookmarkEnd w:id="64"/>
-    <w:bookmarkStart w:id="65" w:name="format-info-filters"/>
+    <w:bookmarkEnd w:id="65"/>
+    <w:bookmarkStart w:id="66" w:name="format-info-filters"/>
     <w:p>
       <w:pPr>
         <w:pStyle w:val="Heading3"/>
@@ -8758,8 +8923,8 @@
         </w:tc>
       </w:tr>
     </w:tbl>
-    <w:bookmarkEnd w:id="65"/>
-    <w:bookmarkStart w:id="66" w:name="source-type-info-tags"/>
+    <w:bookmarkEnd w:id="66"/>
+    <w:bookmarkStart w:id="67" w:name="source-type-info-tags"/>
     <w:p>
       <w:pPr>
         <w:pStyle w:val="Heading3"/>
@@ -8870,8 +9035,8 @@
         <w:t xml:space="preserve">— Debrid-Link cached source</w:t>
       </w:r>
     </w:p>
-    <w:bookmarkEnd w:id="66"/>
-    <w:bookmarkStart w:id="67" w:name="undesirables-keyword-filter"/>
+    <w:bookmarkEnd w:id="67"/>
+    <w:bookmarkStart w:id="68" w:name="undesirables-keyword-filter"/>
     <w:p>
       <w:pPr>
         <w:pStyle w:val="Heading3"/>
@@ -8966,8 +9131,8 @@
         <w:t xml:space="preserve">- Reset to defaults</w:t>
       </w:r>
     </w:p>
-    <w:bookmarkEnd w:id="67"/>
-    <w:bookmarkStart w:id="68" w:name="foreign-language-filter"/>
+    <w:bookmarkEnd w:id="68"/>
+    <w:bookmarkStart w:id="69" w:name="foreign-language-filter"/>
     <w:p>
       <w:pPr>
         <w:pStyle w:val="Heading3"/>
@@ -8984,8 +9149,8 @@
         <w:t xml:space="preserve">Automatically detects and filters releases in a foreign language that don’t match your content’s original language. It reads your Kodi locale settings and the content’s country of origin metadata. Anime is exempt (English dubs are always kept). Can be toggled on/off.</w:t>
       </w:r>
     </w:p>
-    <w:bookmarkEnd w:id="68"/>
-    <w:bookmarkStart w:id="69" w:name="size-filter"/>
+    <w:bookmarkEnd w:id="69"/>
+    <w:bookmarkStart w:id="70" w:name="size-filter"/>
     <w:p>
       <w:pPr>
         <w:pStyle w:val="Heading3"/>
@@ -9007,7 +9172,7 @@
         <w:pStyle w:val="Compact"/>
         <w:numPr>
           <w:ilvl w:val="0"/>
-          <w:numId w:val="1015"/>
+          <w:numId w:val="1016"/>
         </w:numPr>
       </w:pPr>
       <w:r>
@@ -9029,7 +9194,7 @@
         <w:pStyle w:val="Compact"/>
         <w:numPr>
           <w:ilvl w:val="0"/>
-          <w:numId w:val="1015"/>
+          <w:numId w:val="1016"/>
         </w:numPr>
       </w:pPr>
       <w:r>
@@ -9046,8 +9211,8 @@
         <w:t xml:space="preserve">Set explicit MB limits for movies and episodes separately</w:t>
       </w:r>
     </w:p>
-    <w:bookmarkEnd w:id="69"/>
-    <w:bookmarkStart w:id="70" w:name="source-deduplication"/>
+    <w:bookmarkEnd w:id="70"/>
+    <w:bookmarkStart w:id="71" w:name="source-deduplication"/>
     <w:p>
       <w:pPr>
         <w:pStyle w:val="Heading3"/>
@@ -9064,8 +9229,8 @@
         <w:t xml:space="preserve">Identical sources (same hash + same debrid service) are removed from the list. Sources on different debrid services are kept (same hash may be cached on one but not another).</w:t>
       </w:r>
     </w:p>
-    <w:bookmarkEnd w:id="70"/>
-    <w:bookmarkStart w:id="71" w:name="sort-methods"/>
+    <w:bookmarkEnd w:id="71"/>
+    <w:bookmarkStart w:id="72" w:name="sort-methods"/>
     <w:p>
       <w:pPr>
         <w:pStyle w:val="Heading3"/>
@@ -9311,8 +9476,8 @@
         </w:tc>
       </w:tr>
     </w:tbl>
-    <w:bookmarkEnd w:id="71"/>
-    <w:bookmarkStart w:id="72" w:name="interactive-source-select-manual-mode"/>
+    <w:bookmarkEnd w:id="72"/>
+    <w:bookmarkStart w:id="73" w:name="interactive-source-select-manual-mode"/>
     <w:p>
       <w:pPr>
         <w:pStyle w:val="Heading3"/>
@@ -9376,9 +9541,9 @@
         </w:pict>
       </w:r>
     </w:p>
-    <w:bookmarkEnd w:id="72"/>
     <w:bookmarkEnd w:id="73"/>
-    <w:bookmarkStart w:id="84" w:name="playback-system"/>
+    <w:bookmarkEnd w:id="74"/>
+    <w:bookmarkStart w:id="85" w:name="playback-system"/>
     <w:p>
       <w:pPr>
         <w:pStyle w:val="Heading2"/>
@@ -9387,7 +9552,7 @@
         <w:t xml:space="preserve">9. Playback System</w:t>
       </w:r>
     </w:p>
-    <w:bookmarkStart w:id="74" w:name="auto-play-default"/>
+    <w:bookmarkStart w:id="75" w:name="auto-play-default"/>
     <w:p>
       <w:pPr>
         <w:pStyle w:val="Heading3"/>
@@ -9404,8 +9569,8 @@
         <w:t xml:space="preserve">Seren automatically picks the best source, resolves it, and starts playback. If resolution fails, it tries the next source.</w:t>
       </w:r>
     </w:p>
-    <w:bookmarkEnd w:id="74"/>
-    <w:bookmarkStart w:id="75" w:name="manual-source-select"/>
+    <w:bookmarkEnd w:id="75"/>
+    <w:bookmarkStart w:id="76" w:name="manual-source-select"/>
     <w:p>
       <w:pPr>
         <w:pStyle w:val="Heading3"/>
@@ -9422,8 +9587,8 @@
         <w:t xml:space="preserve">Press play, wait for scraping to complete, then a full source list appears for you to choose from. Configurable separately for Movies and Episodes.</w:t>
       </w:r>
     </w:p>
-    <w:bookmarkEnd w:id="75"/>
-    <w:bookmarkStart w:id="76" w:name="resume-bookmark"/>
+    <w:bookmarkEnd w:id="76"/>
+    <w:bookmarkStart w:id="77" w:name="resume-bookmark"/>
     <w:p>
       <w:pPr>
         <w:pStyle w:val="Heading3"/>
@@ -9440,8 +9605,8 @@
         <w:t xml:space="preserve">Seren integrates with Kodi’s bookmark system to resume movies and episodes from where you left off. Resume prompts appear when a bookmark is found. You can force resume on/off per playback.</w:t>
       </w:r>
     </w:p>
-    <w:bookmarkEnd w:id="76"/>
-    <w:bookmarkStart w:id="77" w:name="smart-play"/>
+    <w:bookmarkEnd w:id="77"/>
+    <w:bookmarkStart w:id="78" w:name="smart-play"/>
     <w:p>
       <w:pPr>
         <w:pStyle w:val="Heading3"/>
@@ -9562,8 +9727,8 @@
         <w:t xml:space="preserve">(continue from your last position)</w:t>
       </w:r>
     </w:p>
-    <w:bookmarkEnd w:id="77"/>
-    <w:bookmarkStart w:id="78" w:name="playback-watchdog-optional"/>
+    <w:bookmarkEnd w:id="78"/>
+    <w:bookmarkStart w:id="79" w:name="playback-watchdog-optional"/>
     <w:p>
       <w:pPr>
         <w:pStyle w:val="Heading3"/>
@@ -9601,7 +9766,7 @@
         <w:pStyle w:val="Compact"/>
         <w:numPr>
           <w:ilvl w:val="0"/>
-          <w:numId w:val="1016"/>
+          <w:numId w:val="1017"/>
         </w:numPr>
       </w:pPr>
       <w:r>
@@ -9628,7 +9793,7 @@
         <w:pStyle w:val="Compact"/>
         <w:numPr>
           <w:ilvl w:val="0"/>
-          <w:numId w:val="1016"/>
+          <w:numId w:val="1017"/>
         </w:numPr>
       </w:pPr>
       <w:r>
@@ -9640,7 +9805,7 @@
         <w:pStyle w:val="Compact"/>
         <w:numPr>
           <w:ilvl w:val="0"/>
-          <w:numId w:val="1016"/>
+          <w:numId w:val="1017"/>
         </w:numPr>
       </w:pPr>
       <w:r>
@@ -9652,7 +9817,7 @@
         <w:pStyle w:val="Compact"/>
         <w:numPr>
           <w:ilvl w:val="0"/>
-          <w:numId w:val="1016"/>
+          <w:numId w:val="1017"/>
         </w:numPr>
       </w:pPr>
       <w:r>
@@ -9664,15 +9829,15 @@
         <w:pStyle w:val="Compact"/>
         <w:numPr>
           <w:ilvl w:val="0"/>
-          <w:numId w:val="1016"/>
+          <w:numId w:val="1017"/>
         </w:numPr>
       </w:pPr>
       <w:r>
         <w:t xml:space="preserve">Works for all source types: CDN, torrent, direct, hoster</w:t>
       </w:r>
     </w:p>
-    <w:bookmarkEnd w:id="78"/>
-    <w:bookmarkStart w:id="79" w:name="skip-segments-intro-outro-recap-preview"/>
+    <w:bookmarkEnd w:id="79"/>
+    <w:bookmarkStart w:id="80" w:name="skip-segments-intro-outro-recap-preview"/>
     <w:p>
       <w:pPr>
         <w:pStyle w:val="Heading3"/>
@@ -9916,246 +10081,11 @@
         <w:pStyle w:val="Compact"/>
         <w:numPr>
           <w:ilvl w:val="0"/>
-          <w:numId w:val="1017"/>
+          <w:numId w:val="1018"/>
         </w:numPr>
       </w:pPr>
       <w:r>
         <w:t xml:space="preserve">A skip dialog appears on screen at the detected segment start time</w:t>
-      </w:r>
-    </w:p>
-    <w:p>
-      <w:pPr>
-        <w:pStyle w:val="Compact"/>
-        <w:numPr>
-          <w:ilvl w:val="0"/>
-          <w:numId w:val="1017"/>
-        </w:numPr>
-      </w:pPr>
-      <w:r>
-        <w:rPr>
-          <w:b/>
-          <w:bCs/>
-        </w:rPr>
-        <w:t xml:space="preserve">Auto-skip</w:t>
-      </w:r>
-      <w:r>
-        <w:t xml:space="preserve"> </w:t>
-      </w:r>
-      <w:r>
-        <w:t xml:space="preserve">can be enabled for intros (skips automatically without prompting)</w:t>
-      </w:r>
-    </w:p>
-    <w:p>
-      <w:pPr>
-        <w:pStyle w:val="Compact"/>
-        <w:numPr>
-          <w:ilvl w:val="0"/>
-          <w:numId w:val="1017"/>
-        </w:numPr>
-      </w:pPr>
-      <w:r>
-        <w:t xml:space="preserve">Credits/previews with no end time trigger</w:t>
-      </w:r>
-      <w:r>
-        <w:t xml:space="preserve"> </w:t>
-      </w:r>
-      <w:r>
-        <w:rPr>
-          <w:b/>
-          <w:bCs/>
-        </w:rPr>
-        <w:t xml:space="preserve">Playing Next</w:t>
-      </w:r>
-      <w:r>
-        <w:t xml:space="preserve"> </w:t>
-      </w:r>
-      <w:r>
-        <w:t xml:space="preserve">automatically</w:t>
-      </w:r>
-    </w:p>
-    <w:p>
-      <w:pPr>
-        <w:pStyle w:val="Compact"/>
-        <w:numPr>
-          <w:ilvl w:val="0"/>
-          <w:numId w:val="1017"/>
-        </w:numPr>
-      </w:pPr>
-      <w:r>
-        <w:t xml:space="preserve">Optional TheIntroDB API key for higher rate limits</w:t>
-      </w:r>
-    </w:p>
-    <w:p>
-      <w:pPr>
-        <w:pStyle w:val="Compact"/>
-        <w:numPr>
-          <w:ilvl w:val="0"/>
-          <w:numId w:val="1017"/>
-        </w:numPr>
-      </w:pPr>
-      <w:r>
-        <w:t xml:space="preserve">If a show has no TMDB/IMDb match, TheIntroDB now falls back to a TVDB ID lookup instead of returning no segments</w:t>
-      </w:r>
-    </w:p>
-    <w:p>
-      <w:pPr>
-        <w:pStyle w:val="Compact"/>
-        <w:numPr>
-          <w:ilvl w:val="0"/>
-          <w:numId w:val="1017"/>
-        </w:numPr>
-      </w:pPr>
-      <w:r>
-        <w:t xml:space="preserve">Multiple segments of the same type in one episode are supported (e.g. two separate recap breaks), not just the first one found</w:t>
-      </w:r>
-    </w:p>
-    <w:bookmarkEnd w:id="79"/>
-    <w:bookmarkStart w:id="80" w:name="playing-next"/>
-    <w:p>
-      <w:pPr>
-        <w:pStyle w:val="Heading3"/>
-      </w:pPr>
-      <w:r>
-        <w:t xml:space="preserve">Playing Next</w:t>
-      </w:r>
-    </w:p>
-    <w:p>
-      <w:pPr>
-        <w:pStyle w:val="FirstParagraph"/>
-      </w:pPr>
-      <w:r>
-        <w:t xml:space="preserve">A pre-play popup shows the next episode before the current one ends. Configurable:</w:t>
-      </w:r>
-      <w:r>
-        <w:t xml:space="preserve"> </w:t>
-      </w:r>
-      <w:r>
-        <w:t xml:space="preserve">- How many seconds before the end to show</w:t>
-      </w:r>
-      <w:r>
-        <w:t xml:space="preserve"> </w:t>
-      </w:r>
-      <w:r>
-        <w:t xml:space="preserve">- Whether to show at all</w:t>
-      </w:r>
-      <w:r>
-        <w:t xml:space="preserve"> </w:t>
-      </w:r>
-      <w:r>
-        <w:t xml:space="preserve">- Manual trigger via context menu</w:t>
-      </w:r>
-    </w:p>
-    <w:bookmarkEnd w:id="80"/>
-    <w:bookmarkStart w:id="81" w:name="openinfo-integration"/>
-    <w:p>
-      <w:pPr>
-        <w:pStyle w:val="Heading3"/>
-      </w:pPr>
-      <w:r>
-        <w:t xml:space="preserve">OpenInfo Integration</w:t>
-      </w:r>
-    </w:p>
-    <w:p>
-      <w:pPr>
-        <w:pStyle w:val="FirstParagraph"/>
-      </w:pPr>
-      <w:r>
-        <w:t xml:space="preserve">After a successful play, Seren writes a JSON record to</w:t>
-      </w:r>
-      <w:r>
-        <w:t xml:space="preserve"> </w:t>
-      </w:r>
-      <w:r>
-        <w:rPr>
-          <w:rStyle w:val="VerbatimChar"/>
-        </w:rPr>
-        <w:t xml:space="preserve">addon_data/plugin.video.seren/openinfo_last_resolutions.json</w:t>
-      </w:r>
-      <w:r>
-        <w:t xml:space="preserve"> </w:t>
-      </w:r>
-      <w:r>
-        <w:t xml:space="preserve">with: quality, debrid provider, release title, season/episode, and timestamp. OpenInfo (7.0.19+) reads this and displays</w:t>
-      </w:r>
-      <w:r>
-        <w:t xml:space="preserve"> </w:t>
-      </w:r>
-      <w:r>
-        <w:t xml:space="preserve">“Last played: 4K HDR · Real-Debrid”</w:t>
-      </w:r>
-      <w:r>
-        <w:t xml:space="preserve"> </w:t>
-      </w:r>
-      <w:r>
-        <w:t xml:space="preserve">in its info dialog.</w:t>
-      </w:r>
-    </w:p>
-    <w:bookmarkEnd w:id="81"/>
-    <w:bookmarkStart w:id="82" w:name="uncached-torrent-fallback"/>
-    <w:p>
-      <w:pPr>
-        <w:pStyle w:val="Heading3"/>
-      </w:pPr>
-      <w:r>
-        <w:t xml:space="preserve">Uncached Torrent Fallback</w:t>
-      </w:r>
-    </w:p>
-    <w:p>
-      <w:pPr>
-        <w:pStyle w:val="FirstParagraph"/>
-      </w:pPr>
-      <w:r>
-        <w:t xml:space="preserve">If all cached sources fail, Seren offers to</w:t>
-      </w:r>
-      <w:r>
-        <w:t xml:space="preserve"> </w:t>
-      </w:r>
-      <w:r>
-        <w:rPr>
-          <w:b/>
-          <w:bCs/>
-        </w:rPr>
-        <w:t xml:space="preserve">cache an uncached torrent</w:t>
-      </w:r>
-      <w:r>
-        <w:t xml:space="preserve"> </w:t>
-      </w:r>
-      <w:r>
-        <w:t xml:space="preserve">via Cache Assist. A progress dialog shows the torrent downloading to your debrid cloud, then plays when ready.</w:t>
-      </w:r>
-    </w:p>
-    <w:bookmarkEnd w:id="82"/>
-    <w:bookmarkStart w:id="83" w:name="source-select-re-open"/>
-    <w:p>
-      <w:pPr>
-        <w:pStyle w:val="Heading3"/>
-      </w:pPr>
-      <w:r>
-        <w:t xml:space="preserve">Source Select Re-open</w:t>
-      </w:r>
-    </w:p>
-    <w:p>
-      <w:pPr>
-        <w:pStyle w:val="FirstParagraph"/>
-      </w:pPr>
-      <w:r>
-        <w:t xml:space="preserve">When</w:t>
-      </w:r>
-      <w:r>
-        <w:t xml:space="preserve"> </w:t>
-      </w:r>
-      <w:r>
-        <w:rPr>
-          <w:b/>
-          <w:bCs/>
-        </w:rPr>
-        <w:t xml:space="preserve">Manual Source Select</w:t>
-      </w:r>
-      <w:r>
-        <w:t xml:space="preserve"> </w:t>
-      </w:r>
-      <w:r>
-        <w:t xml:space="preserve">is active and playback ends early (error, cancelled, dead stream), Seren automatically re-opens the Source Select window — no re-scraping required. The same source list is reused from cache. A brief grace period is applied after a playback error before re-opening.</w:t>
       </w:r>
     </w:p>
     <w:p>
@@ -10167,7 +10097,17 @@
         </w:numPr>
       </w:pPr>
       <w:r>
-        <w:t xml:space="preserve">Back-button during buffering exits cleanly without hanging</w:t>
+        <w:rPr>
+          <w:b/>
+          <w:bCs/>
+        </w:rPr>
+        <w:t xml:space="preserve">Auto-skip</w:t>
+      </w:r>
+      <w:r>
+        <w:t xml:space="preserve"> </w:t>
+      </w:r>
+      <w:r>
+        <w:t xml:space="preserve">can be enabled for intros (skips automatically without prompting)</w:t>
       </w:r>
     </w:p>
     <w:p>
@@ -10179,6 +10119,231 @@
         </w:numPr>
       </w:pPr>
       <w:r>
+        <w:t xml:space="preserve">Credits/previews with no end time trigger</w:t>
+      </w:r>
+      <w:r>
+        <w:t xml:space="preserve"> </w:t>
+      </w:r>
+      <w:r>
+        <w:rPr>
+          <w:b/>
+          <w:bCs/>
+        </w:rPr>
+        <w:t xml:space="preserve">Playing Next</w:t>
+      </w:r>
+      <w:r>
+        <w:t xml:space="preserve"> </w:t>
+      </w:r>
+      <w:r>
+        <w:t xml:space="preserve">automatically</w:t>
+      </w:r>
+    </w:p>
+    <w:p>
+      <w:pPr>
+        <w:pStyle w:val="Compact"/>
+        <w:numPr>
+          <w:ilvl w:val="0"/>
+          <w:numId w:val="1018"/>
+        </w:numPr>
+      </w:pPr>
+      <w:r>
+        <w:t xml:space="preserve">Optional TheIntroDB API key for higher rate limits</w:t>
+      </w:r>
+    </w:p>
+    <w:p>
+      <w:pPr>
+        <w:pStyle w:val="Compact"/>
+        <w:numPr>
+          <w:ilvl w:val="0"/>
+          <w:numId w:val="1018"/>
+        </w:numPr>
+      </w:pPr>
+      <w:r>
+        <w:t xml:space="preserve">If a show has no TMDB/IMDb match, TheIntroDB now falls back to a TVDB ID lookup instead of returning no segments</w:t>
+      </w:r>
+    </w:p>
+    <w:p>
+      <w:pPr>
+        <w:pStyle w:val="Compact"/>
+        <w:numPr>
+          <w:ilvl w:val="0"/>
+          <w:numId w:val="1018"/>
+        </w:numPr>
+      </w:pPr>
+      <w:r>
+        <w:t xml:space="preserve">Multiple segments of the same type in one episode are supported (e.g. two separate recap breaks), not just the first one found</w:t>
+      </w:r>
+    </w:p>
+    <w:bookmarkEnd w:id="80"/>
+    <w:bookmarkStart w:id="81" w:name="playing-next"/>
+    <w:p>
+      <w:pPr>
+        <w:pStyle w:val="Heading3"/>
+      </w:pPr>
+      <w:r>
+        <w:t xml:space="preserve">Playing Next</w:t>
+      </w:r>
+    </w:p>
+    <w:p>
+      <w:pPr>
+        <w:pStyle w:val="FirstParagraph"/>
+      </w:pPr>
+      <w:r>
+        <w:t xml:space="preserve">A pre-play popup shows the next episode before the current one ends. Configurable:</w:t>
+      </w:r>
+      <w:r>
+        <w:t xml:space="preserve"> </w:t>
+      </w:r>
+      <w:r>
+        <w:t xml:space="preserve">- How many seconds before the end to show</w:t>
+      </w:r>
+      <w:r>
+        <w:t xml:space="preserve"> </w:t>
+      </w:r>
+      <w:r>
+        <w:t xml:space="preserve">- Whether to show at all</w:t>
+      </w:r>
+      <w:r>
+        <w:t xml:space="preserve"> </w:t>
+      </w:r>
+      <w:r>
+        <w:t xml:space="preserve">- Manual trigger via context menu</w:t>
+      </w:r>
+    </w:p>
+    <w:bookmarkEnd w:id="81"/>
+    <w:bookmarkStart w:id="82" w:name="openinfo-integration"/>
+    <w:p>
+      <w:pPr>
+        <w:pStyle w:val="Heading3"/>
+      </w:pPr>
+      <w:r>
+        <w:t xml:space="preserve">OpenInfo Integration</w:t>
+      </w:r>
+    </w:p>
+    <w:p>
+      <w:pPr>
+        <w:pStyle w:val="FirstParagraph"/>
+      </w:pPr>
+      <w:r>
+        <w:t xml:space="preserve">After a successful play, Seren writes a JSON record to</w:t>
+      </w:r>
+      <w:r>
+        <w:t xml:space="preserve"> </w:t>
+      </w:r>
+      <w:r>
+        <w:rPr>
+          <w:rStyle w:val="VerbatimChar"/>
+        </w:rPr>
+        <w:t xml:space="preserve">addon_data/plugin.video.seren/openinfo_last_resolutions.json</w:t>
+      </w:r>
+      <w:r>
+        <w:t xml:space="preserve"> </w:t>
+      </w:r>
+      <w:r>
+        <w:t xml:space="preserve">with: quality, debrid provider, release title, season/episode, and timestamp. OpenInfo (7.0.19+) reads this and displays</w:t>
+      </w:r>
+      <w:r>
+        <w:t xml:space="preserve"> </w:t>
+      </w:r>
+      <w:r>
+        <w:t xml:space="preserve">“Last played: 4K HDR · Real-Debrid”</w:t>
+      </w:r>
+      <w:r>
+        <w:t xml:space="preserve"> </w:t>
+      </w:r>
+      <w:r>
+        <w:t xml:space="preserve">in its info dialog.</w:t>
+      </w:r>
+    </w:p>
+    <w:bookmarkEnd w:id="82"/>
+    <w:bookmarkStart w:id="83" w:name="uncached-torrent-fallback"/>
+    <w:p>
+      <w:pPr>
+        <w:pStyle w:val="Heading3"/>
+      </w:pPr>
+      <w:r>
+        <w:t xml:space="preserve">Uncached Torrent Fallback</w:t>
+      </w:r>
+    </w:p>
+    <w:p>
+      <w:pPr>
+        <w:pStyle w:val="FirstParagraph"/>
+      </w:pPr>
+      <w:r>
+        <w:t xml:space="preserve">If all cached sources fail, Seren offers to</w:t>
+      </w:r>
+      <w:r>
+        <w:t xml:space="preserve"> </w:t>
+      </w:r>
+      <w:r>
+        <w:rPr>
+          <w:b/>
+          <w:bCs/>
+        </w:rPr>
+        <w:t xml:space="preserve">cache an uncached torrent</w:t>
+      </w:r>
+      <w:r>
+        <w:t xml:space="preserve"> </w:t>
+      </w:r>
+      <w:r>
+        <w:t xml:space="preserve">via Cache Assist. A progress dialog shows the torrent downloading to your debrid cloud, then plays when ready.</w:t>
+      </w:r>
+    </w:p>
+    <w:bookmarkEnd w:id="83"/>
+    <w:bookmarkStart w:id="84" w:name="source-select-re-open"/>
+    <w:p>
+      <w:pPr>
+        <w:pStyle w:val="Heading3"/>
+      </w:pPr>
+      <w:r>
+        <w:t xml:space="preserve">Source Select Re-open</w:t>
+      </w:r>
+    </w:p>
+    <w:p>
+      <w:pPr>
+        <w:pStyle w:val="FirstParagraph"/>
+      </w:pPr>
+      <w:r>
+        <w:t xml:space="preserve">When</w:t>
+      </w:r>
+      <w:r>
+        <w:t xml:space="preserve"> </w:t>
+      </w:r>
+      <w:r>
+        <w:rPr>
+          <w:b/>
+          <w:bCs/>
+        </w:rPr>
+        <w:t xml:space="preserve">Manual Source Select</w:t>
+      </w:r>
+      <w:r>
+        <w:t xml:space="preserve"> </w:t>
+      </w:r>
+      <w:r>
+        <w:t xml:space="preserve">is active and playback ends early (error, cancelled, dead stream), Seren automatically re-opens the Source Select window — no re-scraping required. The same source list is reused from cache. A brief grace period is applied after a playback error before re-opening.</w:t>
+      </w:r>
+    </w:p>
+    <w:p>
+      <w:pPr>
+        <w:pStyle w:val="Compact"/>
+        <w:numPr>
+          <w:ilvl w:val="0"/>
+          <w:numId w:val="1019"/>
+        </w:numPr>
+      </w:pPr>
+      <w:r>
+        <w:t xml:space="preserve">Back-button during buffering exits cleanly without hanging</w:t>
+      </w:r>
+    </w:p>
+    <w:p>
+      <w:pPr>
+        <w:pStyle w:val="Compact"/>
+        <w:numPr>
+          <w:ilvl w:val="0"/>
+          <w:numId w:val="1019"/>
+        </w:numPr>
+      </w:pPr>
+      <w:r>
         <w:t xml:space="preserve">Natural playback completion (episode finishes normally) does not trigger re-open</w:t>
       </w:r>
     </w:p>
@@ -10189,9 +10354,9 @@
         </w:pict>
       </w:r>
     </w:p>
-    <w:bookmarkEnd w:id="83"/>
     <w:bookmarkEnd w:id="84"/>
-    <w:bookmarkStart w:id="95" w:name="anime-features"/>
+    <w:bookmarkEnd w:id="85"/>
+    <w:bookmarkStart w:id="96" w:name="anime-features"/>
     <w:p>
       <w:pPr>
         <w:pStyle w:val="Heading2"/>
@@ -10208,7 +10373,7 @@
         <w:t xml:space="preserve">Seren has deep, dedicated anime support built in, covering everything from metadata to scraping to playback.</w:t>
       </w:r>
     </w:p>
-    <w:bookmarkStart w:id="85" w:name="smart-anime-search"/>
+    <w:bookmarkStart w:id="86" w:name="smart-anime-search"/>
     <w:p>
       <w:pPr>
         <w:pStyle w:val="Heading3"/>
@@ -10271,8 +10436,8 @@
         <w:t xml:space="preserve">Results are session-cached so repeat scrapes for the same show are instant.</w:t>
       </w:r>
     </w:p>
-    <w:bookmarkEnd w:id="85"/>
-    <w:bookmarkStart w:id="86" w:name="chinese-donghua-support"/>
+    <w:bookmarkEnd w:id="86"/>
+    <w:bookmarkStart w:id="87" w:name="chinese-donghua-support"/>
     <w:p>
       <w:pPr>
         <w:pStyle w:val="Heading3"/>
@@ -10330,8 +10495,8 @@
         <w:t xml:space="preserve">, and similar titles automatically receive AniList title enrichment and anime-tier scraping.</w:t>
       </w:r>
     </w:p>
-    <w:bookmarkEnd w:id="86"/>
-    <w:bookmarkStart w:id="87" w:name="cour-season-correction"/>
+    <w:bookmarkEnd w:id="87"/>
+    <w:bookmarkStart w:id="88" w:name="cour-season-correction"/>
     <w:p>
       <w:pPr>
         <w:pStyle w:val="Heading3"/>
@@ -10378,8 +10543,8 @@
         <w:t xml:space="preserve">- Uses AniList cour detection + Simkl + AniZip + Tenrai + AniDB + Kitsu as fallback chain</w:t>
       </w:r>
     </w:p>
-    <w:bookmarkEnd w:id="87"/>
-    <w:bookmarkStart w:id="88" w:name="anidb-integration"/>
+    <w:bookmarkEnd w:id="88"/>
+    <w:bookmarkStart w:id="89" w:name="anidb-integration"/>
     <w:p>
       <w:pPr>
         <w:pStyle w:val="Heading3"/>
@@ -10521,8 +10686,8 @@
         <w:t xml:space="preserve">for fansub group information</w:t>
       </w:r>
     </w:p>
-    <w:bookmarkEnd w:id="88"/>
-    <w:bookmarkStart w:id="89" w:name="dub-sub-preference"/>
+    <w:bookmarkEnd w:id="89"/>
+    <w:bookmarkStart w:id="90" w:name="dub-sub-preference"/>
     <w:p>
       <w:pPr>
         <w:pStyle w:val="Heading3"/>
@@ -10670,8 +10835,8 @@
         <w:t xml:space="preserve">Powered by a MAL-Dubs database updated automatically.</w:t>
       </w:r>
     </w:p>
-    <w:bookmarkEnd w:id="89"/>
-    <w:bookmarkStart w:id="90" w:name="filler-episode-detection"/>
+    <w:bookmarkEnd w:id="90"/>
+    <w:bookmarkStart w:id="91" w:name="filler-episode-detection"/>
     <w:p>
       <w:pPr>
         <w:pStyle w:val="Heading3"/>
@@ -10688,8 +10853,8 @@
         <w:t xml:space="preserve">Seren can detect filler episodes and optionally warn or skip them. Uses community filler databases.</w:t>
       </w:r>
     </w:p>
-    <w:bookmarkEnd w:id="90"/>
-    <w:bookmarkStart w:id="91" w:name="skip-intro-outro-anime-specific"/>
+    <w:bookmarkEnd w:id="91"/>
+    <w:bookmarkStart w:id="92" w:name="skip-intro-outro-anime-specific"/>
     <w:p>
       <w:pPr>
         <w:pStyle w:val="Heading3"/>
@@ -10754,8 +10919,8 @@
         <w:t xml:space="preserve">dialog appears on-screen at the exact segment timestamp.</w:t>
       </w:r>
     </w:p>
-    <w:bookmarkEnd w:id="91"/>
-    <w:bookmarkStart w:id="92" w:name="title-substitution"/>
+    <w:bookmarkEnd w:id="92"/>
+    <w:bookmarkStart w:id="93" w:name="title-substitution"/>
     <w:p>
       <w:pPr>
         <w:pStyle w:val="Heading3"/>
@@ -10790,8 +10955,8 @@
         <w:t xml:space="preserve">), add a rule and Seren uses the correct search term automatically. Ships with 28 common entries.</w:t>
       </w:r>
     </w:p>
-    <w:bookmarkEnd w:id="92"/>
-    <w:bookmarkStart w:id="93" w:name="smart-search-toggles"/>
+    <w:bookmarkEnd w:id="93"/>
+    <w:bookmarkStart w:id="94" w:name="smart-search-toggles"/>
     <w:p>
       <w:pPr>
         <w:pStyle w:val="Heading3"/>
@@ -10832,8 +10997,8 @@
         <w:t xml:space="preserve">- Asian Drama (Korean, Chinese, Japanese, etc.)</w:t>
       </w:r>
     </w:p>
-    <w:bookmarkEnd w:id="93"/>
-    <w:bookmarkStart w:id="94" w:name="asian-drama-support"/>
+    <w:bookmarkEnd w:id="94"/>
+    <w:bookmarkStart w:id="95" w:name="asian-drama-support"/>
     <w:p>
       <w:pPr>
         <w:pStyle w:val="Heading3"/>
@@ -10875,9 +11040,9 @@
         </w:pict>
       </w:r>
     </w:p>
-    <w:bookmarkEnd w:id="94"/>
     <w:bookmarkEnd w:id="95"/>
-    <w:bookmarkStart w:id="102" w:name="debrid-services"/>
+    <w:bookmarkEnd w:id="96"/>
+    <w:bookmarkStart w:id="103" w:name="debrid-services"/>
     <w:p>
       <w:pPr>
         <w:pStyle w:val="Heading2"/>
@@ -10894,177 +11059,13 @@
         <w:t xml:space="preserve">Seren supports five debrid services with full feature parity across all of them.</w:t>
       </w:r>
     </w:p>
-    <w:bookmarkStart w:id="96" w:name="premiumize-pm"/>
+    <w:bookmarkStart w:id="97" w:name="premiumize-pm"/>
     <w:p>
       <w:pPr>
         <w:pStyle w:val="Heading3"/>
       </w:pPr>
       <w:r>
         <w:t xml:space="preserve">Premiumize (PM)</w:t>
-      </w:r>
-    </w:p>
-    <w:p>
-      <w:pPr>
-        <w:pStyle w:val="Compact"/>
-        <w:numPr>
-          <w:ilvl w:val="0"/>
-          <w:numId w:val="1019"/>
-        </w:numPr>
-      </w:pPr>
-      <w:r>
-        <w:rPr>
-          <w:b/>
-          <w:bCs/>
-        </w:rPr>
-        <w:t xml:space="preserve">Auth:</w:t>
-      </w:r>
-      <w:r>
-        <w:t xml:space="preserve"> </w:t>
-      </w:r>
-      <w:r>
-        <w:t xml:space="preserve">OAuth browser-based</w:t>
-      </w:r>
-    </w:p>
-    <w:p>
-      <w:pPr>
-        <w:pStyle w:val="Compact"/>
-        <w:numPr>
-          <w:ilvl w:val="0"/>
-          <w:numId w:val="1019"/>
-        </w:numPr>
-      </w:pPr>
-      <w:r>
-        <w:rPr>
-          <w:b/>
-          <w:bCs/>
-        </w:rPr>
-        <w:t xml:space="preserve">Cache Check:</w:t>
-      </w:r>
-      <w:r>
-        <w:t xml:space="preserve"> </w:t>
-      </w:r>
-      <w:r>
-        <w:t xml:space="preserve">Native API (fastest, most accurate)</w:t>
-      </w:r>
-    </w:p>
-    <w:p>
-      <w:pPr>
-        <w:pStyle w:val="Compact"/>
-        <w:numPr>
-          <w:ilvl w:val="0"/>
-          <w:numId w:val="1019"/>
-        </w:numPr>
-      </w:pPr>
-      <w:r>
-        <w:rPr>
-          <w:b/>
-          <w:bCs/>
-        </w:rPr>
-        <w:t xml:space="preserve">Cloud Scraper:</w:t>
-      </w:r>
-      <w:r>
-        <w:t xml:space="preserve"> </w:t>
-      </w:r>
-      <w:r>
-        <w:t xml:space="preserve">Yes — scans your PM cloud for cached files</w:t>
-      </w:r>
-    </w:p>
-    <w:p>
-      <w:pPr>
-        <w:pStyle w:val="Compact"/>
-        <w:numPr>
-          <w:ilvl w:val="0"/>
-          <w:numId w:val="1019"/>
-        </w:numPr>
-      </w:pPr>
-      <w:r>
-        <w:rPr>
-          <w:b/>
-          <w:bCs/>
-        </w:rPr>
-        <w:t xml:space="preserve">My Files:</w:t>
-      </w:r>
-      <w:r>
-        <w:t xml:space="preserve"> </w:t>
-      </w:r>
-      <w:r>
-        <w:t xml:space="preserve">Full file browser for your PM cloud storage</w:t>
-      </w:r>
-    </w:p>
-    <w:p>
-      <w:pPr>
-        <w:pStyle w:val="Compact"/>
-        <w:numPr>
-          <w:ilvl w:val="0"/>
-          <w:numId w:val="1019"/>
-        </w:numPr>
-      </w:pPr>
-      <w:r>
-        <w:rPr>
-          <w:b/>
-          <w:bCs/>
-        </w:rPr>
-        <w:t xml:space="preserve">Transfers:</w:t>
-      </w:r>
-      <w:r>
-        <w:t xml:space="preserve"> </w:t>
-      </w:r>
-      <w:r>
-        <w:t xml:space="preserve">View active/queued transfers</w:t>
-      </w:r>
-    </w:p>
-    <w:p>
-      <w:pPr>
-        <w:pStyle w:val="Compact"/>
-        <w:numPr>
-          <w:ilvl w:val="0"/>
-          <w:numId w:val="1019"/>
-        </w:numPr>
-      </w:pPr>
-      <w:r>
-        <w:rPr>
-          <w:b/>
-          <w:bCs/>
-        </w:rPr>
-        <w:t xml:space="preserve">Smart Delete:</w:t>
-      </w:r>
-      <w:r>
-        <w:t xml:space="preserve"> </w:t>
-      </w:r>
-      <w:r>
-        <w:t xml:space="preserve">Delete after watched, or delete immediately after play</w:t>
-      </w:r>
-    </w:p>
-    <w:p>
-      <w:pPr>
-        <w:pStyle w:val="Compact"/>
-        <w:numPr>
-          <w:ilvl w:val="0"/>
-          <w:numId w:val="1019"/>
-        </w:numPr>
-      </w:pPr>
-      <w:r>
-        <w:rPr>
-          <w:b/>
-          <w:bCs/>
-        </w:rPr>
-        <w:t xml:space="preserve">Add to Cloud:</w:t>
-      </w:r>
-      <w:r>
-        <w:t xml:space="preserve"> </w:t>
-      </w:r>
-      <w:r>
-        <w:t xml:space="preserve">Yes — manually add magnet links to PM cloud</w:t>
-      </w:r>
-    </w:p>
-    <w:bookmarkEnd w:id="96"/>
-    <w:bookmarkStart w:id="97" w:name="real-debrid-rd"/>
-    <w:p>
-      <w:pPr>
-        <w:pStyle w:val="Heading3"/>
-      </w:pPr>
-      <w:r>
-        <w:t xml:space="preserve">Real-Debrid (RD)</w:t>
       </w:r>
     </w:p>
     <w:p>
@@ -11086,7 +11087,7 @@
         <w:t xml:space="preserve"> </w:t>
       </w:r>
       <w:r>
-        <w:t xml:space="preserve">Device code (shown on screen)</w:t>
+        <w:t xml:space="preserve">OAuth browser-based</w:t>
       </w:r>
     </w:p>
     <w:p>
@@ -11108,19 +11109,7 @@
         <w:t xml:space="preserve"> </w:t>
       </w:r>
       <w:r>
-        <w:t xml:space="preserve">Torrentio (your RD key) + DMM Availability API [+ MF if</w:t>
-      </w:r>
-      <w:r>
-        <w:t xml:space="preserve"> </w:t>
-      </w:r>
-      <w:r>
-        <w:rPr>
-          <w:rStyle w:val="VerbatimChar"/>
-        </w:rPr>
-        <w:t xml:space="preserve">mf.service=2</w:t>
-      </w:r>
-      <w:r>
-        <w:t xml:space="preserve">]</w:t>
+        <w:t xml:space="preserve">Native API (fastest, most accurate)</w:t>
       </w:r>
     </w:p>
     <w:p>
@@ -11142,7 +11131,7 @@
         <w:t xml:space="preserve"> </w:t>
       </w:r>
       <w:r>
-        <w:t xml:space="preserve">Yes — scans your RD torrent list</w:t>
+        <w:t xml:space="preserve">Yes — scans your PM cloud for cached files</w:t>
       </w:r>
     </w:p>
     <w:p>
@@ -11164,7 +11153,7 @@
         <w:t xml:space="preserve"> </w:t>
       </w:r>
       <w:r>
-        <w:t xml:space="preserve">Full browser (downloads folder)</w:t>
+        <w:t xml:space="preserve">Full file browser for your PM cloud storage</w:t>
       </w:r>
     </w:p>
     <w:p>
@@ -11186,7 +11175,7 @@
         <w:t xml:space="preserve"> </w:t>
       </w:r>
       <w:r>
-        <w:t xml:space="preserve">View active transfers</w:t>
+        <w:t xml:space="preserve">View active/queued transfers</w:t>
       </w:r>
     </w:p>
     <w:p>
@@ -11208,7 +11197,7 @@
         <w:t xml:space="preserve"> </w:t>
       </w:r>
       <w:r>
-        <w:t xml:space="preserve">Auto-delete after play (configurable)</w:t>
+        <w:t xml:space="preserve">Delete after watched, or delete immediately after play</w:t>
       </w:r>
     </w:p>
     <w:p>
@@ -11224,76 +11213,23 @@
           <w:b/>
           <w:bCs/>
         </w:rPr>
-        <w:t xml:space="preserve">Store-All (StoreAll):</w:t>
-      </w:r>
-      <w:r>
-        <w:t xml:space="preserve"> </w:t>
-      </w:r>
-      <w:r>
-        <w:t xml:space="preserve">Optional — stores top unchecked hashes as sources; threshold and limit configurable</w:t>
-      </w:r>
-    </w:p>
-    <w:p>
-      <w:pPr>
-        <w:pStyle w:val="Compact"/>
-        <w:numPr>
-          <w:ilvl w:val="0"/>
-          <w:numId w:val="1020"/>
-        </w:numPr>
-      </w:pPr>
-      <w:r>
-        <w:rPr>
-          <w:b/>
-          <w:bCs/>
-        </w:rPr>
-        <w:t xml:space="preserve">Account Info:</w:t>
-      </w:r>
-      <w:r>
-        <w:t xml:space="preserve"> </w:t>
-      </w:r>
-      <w:r>
-        <w:t xml:space="preserve">Shows account expiry, used space, traffic, etc.</w:t>
-      </w:r>
-    </w:p>
-    <w:p>
-      <w:pPr>
-        <w:pStyle w:val="Compact"/>
-        <w:numPr>
-          <w:ilvl w:val="0"/>
-          <w:numId w:val="1020"/>
-        </w:numPr>
-      </w:pPr>
-      <w:r>
-        <w:rPr>
-          <w:b/>
-          <w:bCs/>
-        </w:rPr>
-        <w:t xml:space="preserve">DMCA Detection:</w:t>
-      </w:r>
-      <w:r>
-        <w:t xml:space="preserve"> </w:t>
-      </w:r>
-      <w:r>
-        <w:t xml:space="preserve">HTTP 451 / error_code 35 (</w:t>
-      </w:r>
-      <w:r>
-        <w:rPr>
-          <w:rStyle w:val="VerbatimChar"/>
-        </w:rPr>
-        <w:t xml:space="preserve">InfringingFile</w:t>
-      </w:r>
-      <w:r>
-        <w:t xml:space="preserve">) detected at resolve time; hash is blocked for 7 days in local debrid cache to prevent retry loops</w:t>
+        <w:t xml:space="preserve">Add to Cloud:</w:t>
+      </w:r>
+      <w:r>
+        <w:t xml:space="preserve"> </w:t>
+      </w:r>
+      <w:r>
+        <w:t xml:space="preserve">Yes — manually add magnet links to PM cloud</w:t>
       </w:r>
     </w:p>
     <w:bookmarkEnd w:id="97"/>
-    <w:bookmarkStart w:id="98" w:name="alldebrid-ad"/>
+    <w:bookmarkStart w:id="98" w:name="real-debrid-rd"/>
     <w:p>
       <w:pPr>
         <w:pStyle w:val="Heading3"/>
       </w:pPr>
       <w:r>
-        <w:t xml:space="preserve">AllDebrid (AD)</w:t>
+        <w:t xml:space="preserve">Real-Debrid (RD)</w:t>
       </w:r>
     </w:p>
     <w:p>
@@ -11315,7 +11251,7 @@
         <w:t xml:space="preserve"> </w:t>
       </w:r>
       <w:r>
-        <w:t xml:space="preserve">API key input</w:t>
+        <w:t xml:space="preserve">Device code (shown on screen)</w:t>
       </w:r>
     </w:p>
     <w:p>
@@ -11337,7 +11273,7 @@
         <w:t xml:space="preserve"> </w:t>
       </w:r>
       <w:r>
-        <w:t xml:space="preserve">AIOStreams + Torrentio (your AD key) + Comet — 3-way parallel [+ MF if</w:t>
+        <w:t xml:space="preserve">Torrentio (your RD key) + DMM Availability API [+ MF if</w:t>
       </w:r>
       <w:r>
         <w:t xml:space="preserve"> </w:t>
@@ -11346,7 +11282,7 @@
         <w:rPr>
           <w:rStyle w:val="VerbatimChar"/>
         </w:rPr>
-        <w:t xml:space="preserve">mf.service=1</w:t>
+        <w:t xml:space="preserve">mf.service=2</w:t>
       </w:r>
       <w:r>
         <w:t xml:space="preserve">]</w:t>
@@ -11371,7 +11307,7 @@
         <w:t xml:space="preserve"> </w:t>
       </w:r>
       <w:r>
-        <w:t xml:space="preserve">Yes</w:t>
+        <w:t xml:space="preserve">Yes — scans your RD torrent list</w:t>
       </w:r>
     </w:p>
     <w:p>
@@ -11393,7 +11329,7 @@
         <w:t xml:space="preserve"> </w:t>
       </w:r>
       <w:r>
-        <w:t xml:space="preserve">Full browser</w:t>
+        <w:t xml:space="preserve">Full browser (downloads folder)</w:t>
       </w:r>
     </w:p>
     <w:p>
@@ -11415,7 +11351,7 @@
         <w:t xml:space="preserve"> </w:t>
       </w:r>
       <w:r>
-        <w:t xml:space="preserve">View active magnets</w:t>
+        <w:t xml:space="preserve">View active transfers</w:t>
       </w:r>
     </w:p>
     <w:p>
@@ -11431,28 +11367,13 @@
           <w:b/>
           <w:bCs/>
         </w:rPr>
-        <w:t xml:space="preserve">MagnetUpload (optional):</w:t>
-      </w:r>
-      <w:r>
-        <w:t xml:space="preserve"> </w:t>
-      </w:r>
-      <w:r>
-        <w:t xml:space="preserve">Uploads top unchecked torrents to AD cloud in batches of 10, checks if cached; cleans up non-cached immediately. Controlled by</w:t>
-      </w:r>
-      <w:r>
-        <w:t xml:space="preserve"> </w:t>
-      </w:r>
-      <w:r>
-        <w:rPr>
-          <w:rStyle w:val="VerbatimChar"/>
-        </w:rPr>
-        <w:t xml:space="preserve">alldebrid.magnetupload</w:t>
-      </w:r>
-      <w:r>
-        <w:t xml:space="preserve"> </w:t>
-      </w:r>
-      <w:r>
-        <w:t xml:space="preserve">toggle.</w:t>
+        <w:t xml:space="preserve">Smart Delete:</w:t>
+      </w:r>
+      <w:r>
+        <w:t xml:space="preserve"> </w:t>
+      </w:r>
+      <w:r>
+        <w:t xml:space="preserve">Auto-delete after play (configurable)</w:t>
       </w:r>
     </w:p>
     <w:p>
@@ -11468,13 +11389,13 @@
           <w:b/>
           <w:bCs/>
         </w:rPr>
-        <w:t xml:space="preserve">Smart Delete:</w:t>
-      </w:r>
-      <w:r>
-        <w:t xml:space="preserve"> </w:t>
-      </w:r>
-      <w:r>
-        <w:t xml:space="preserve">Auto-delete + MagnetUpload cleanup on play</w:t>
+        <w:t xml:space="preserve">Store-All (StoreAll):</w:t>
+      </w:r>
+      <w:r>
+        <w:t xml:space="preserve"> </w:t>
+      </w:r>
+      <w:r>
+        <w:t xml:space="preserve">Optional — stores top unchecked hashes as sources; threshold and limit configurable</w:t>
       </w:r>
     </w:p>
     <w:p>
@@ -11490,23 +11411,54 @@
           <w:b/>
           <w:bCs/>
         </w:rPr>
-        <w:t xml:space="preserve">Store-All (StoreAll):</w:t>
-      </w:r>
-      <w:r>
-        <w:t xml:space="preserve"> </w:t>
-      </w:r>
-      <w:r>
-        <w:t xml:space="preserve">Optional with activation threshold and unverified source limit</w:t>
+        <w:t xml:space="preserve">Account Info:</w:t>
+      </w:r>
+      <w:r>
+        <w:t xml:space="preserve"> </w:t>
+      </w:r>
+      <w:r>
+        <w:t xml:space="preserve">Shows account expiry, used space, traffic, etc.</w:t>
+      </w:r>
+    </w:p>
+    <w:p>
+      <w:pPr>
+        <w:pStyle w:val="Compact"/>
+        <w:numPr>
+          <w:ilvl w:val="0"/>
+          <w:numId w:val="1021"/>
+        </w:numPr>
+      </w:pPr>
+      <w:r>
+        <w:rPr>
+          <w:b/>
+          <w:bCs/>
+        </w:rPr>
+        <w:t xml:space="preserve">DMCA Detection:</w:t>
+      </w:r>
+      <w:r>
+        <w:t xml:space="preserve"> </w:t>
+      </w:r>
+      <w:r>
+        <w:t xml:space="preserve">HTTP 451 / error_code 35 (</w:t>
+      </w:r>
+      <w:r>
+        <w:rPr>
+          <w:rStyle w:val="VerbatimChar"/>
+        </w:rPr>
+        <w:t xml:space="preserve">InfringingFile</w:t>
+      </w:r>
+      <w:r>
+        <w:t xml:space="preserve">) detected at resolve time; hash is blocked for 7 days in local debrid cache to prevent retry loops</w:t>
       </w:r>
     </w:p>
     <w:bookmarkEnd w:id="98"/>
-    <w:bookmarkStart w:id="99" w:name="torbox-tb"/>
+    <w:bookmarkStart w:id="99" w:name="alldebrid-ad"/>
     <w:p>
       <w:pPr>
         <w:pStyle w:val="Heading3"/>
       </w:pPr>
       <w:r>
-        <w:t xml:space="preserve">TorBox (TB)</w:t>
+        <w:t xml:space="preserve">AllDebrid (AD)</w:t>
       </w:r>
     </w:p>
     <w:p>
@@ -11528,7 +11480,7 @@
         <w:t xml:space="preserve"> </w:t>
       </w:r>
       <w:r>
-        <w:t xml:space="preserve">API token input</w:t>
+        <w:t xml:space="preserve">API key input</w:t>
       </w:r>
     </w:p>
     <w:p>
@@ -11550,7 +11502,7 @@
         <w:t xml:space="preserve"> </w:t>
       </w:r>
       <w:r>
-        <w:t xml:space="preserve">Seedbox oracle (fetches</w:t>
+        <w:t xml:space="preserve">AIOStreams + Torrentio (your AD key) + Comet — 3-way parallel [+ MF if</w:t>
       </w:r>
       <w:r>
         <w:t xml:space="preserve"> </w:t>
@@ -11559,22 +11511,10 @@
         <w:rPr>
           <w:rStyle w:val="VerbatimChar"/>
         </w:rPr>
-        <w:t xml:space="preserve">/v2/seedbox/list</w:t>
-      </w:r>
-      <w:r>
-        <w:t xml:space="preserve"> </w:t>
-      </w:r>
-      <w:r>
-        <w:t xml:space="preserve">once per session, checks if hash is in your library); speculative probe (</w:t>
-      </w:r>
-      <w:r>
-        <w:rPr>
-          <w:rStyle w:val="VerbatimChar"/>
-        </w:rPr>
-        <w:t xml:space="preserve">async=true</w:t>
-      </w:r>
-      <w:r>
-        <w:t xml:space="preserve">) for near-instant cache detection</w:t>
+        <w:t xml:space="preserve">mf.service=1</w:t>
+      </w:r>
+      <w:r>
+        <w:t xml:space="preserve">]</w:t>
       </w:r>
     </w:p>
     <w:p>
@@ -11596,7 +11536,7 @@
         <w:t xml:space="preserve"> </w:t>
       </w:r>
       <w:r>
-        <w:t xml:space="preserve">Yes — scans your TB seedbox</w:t>
+        <w:t xml:space="preserve">Yes</w:t>
       </w:r>
     </w:p>
     <w:p>
@@ -11640,7 +11580,7 @@
         <w:t xml:space="preserve"> </w:t>
       </w:r>
       <w:r>
-        <w:t xml:space="preserve">View active torrents/Usenet items</w:t>
+        <w:t xml:space="preserve">View active magnets</w:t>
       </w:r>
     </w:p>
     <w:p>
@@ -11656,13 +11596,28 @@
           <w:b/>
           <w:bCs/>
         </w:rPr>
-        <w:t xml:space="preserve">Usenet search:</w:t>
-      </w:r>
-      <w:r>
-        <w:t xml:space="preserve"> </w:t>
-      </w:r>
-      <w:r>
-        <w:t xml:space="preserve">Built-in NZB scraper for TorBox Usenet accounts</w:t>
+        <w:t xml:space="preserve">MagnetUpload (optional):</w:t>
+      </w:r>
+      <w:r>
+        <w:t xml:space="preserve"> </w:t>
+      </w:r>
+      <w:r>
+        <w:t xml:space="preserve">Uploads top unchecked torrents to AD cloud in batches of 10, checks if cached; cleans up non-cached immediately. Controlled by</w:t>
+      </w:r>
+      <w:r>
+        <w:t xml:space="preserve"> </w:t>
+      </w:r>
+      <w:r>
+        <w:rPr>
+          <w:rStyle w:val="VerbatimChar"/>
+        </w:rPr>
+        <w:t xml:space="preserve">alldebrid.magnetupload</w:t>
+      </w:r>
+      <w:r>
+        <w:t xml:space="preserve"> </w:t>
+      </w:r>
+      <w:r>
+        <w:t xml:space="preserve">toggle.</w:t>
       </w:r>
     </w:p>
     <w:p>
@@ -11684,17 +11639,39 @@
         <w:t xml:space="preserve"> </w:t>
       </w:r>
       <w:r>
-        <w:t xml:space="preserve">Auto-delete after watch</w:t>
+        <w:t xml:space="preserve">Auto-delete + MagnetUpload cleanup on play</w:t>
+      </w:r>
+    </w:p>
+    <w:p>
+      <w:pPr>
+        <w:pStyle w:val="Compact"/>
+        <w:numPr>
+          <w:ilvl w:val="0"/>
+          <w:numId w:val="1022"/>
+        </w:numPr>
+      </w:pPr>
+      <w:r>
+        <w:rPr>
+          <w:b/>
+          <w:bCs/>
+        </w:rPr>
+        <w:t xml:space="preserve">Store-All (StoreAll):</w:t>
+      </w:r>
+      <w:r>
+        <w:t xml:space="preserve"> </w:t>
+      </w:r>
+      <w:r>
+        <w:t xml:space="preserve">Optional with activation threshold and unverified source limit</w:t>
       </w:r>
     </w:p>
     <w:bookmarkEnd w:id="99"/>
-    <w:bookmarkStart w:id="100" w:name="debrid-link-dl"/>
+    <w:bookmarkStart w:id="100" w:name="torbox-tb"/>
     <w:p>
       <w:pPr>
         <w:pStyle w:val="Heading3"/>
       </w:pPr>
       <w:r>
-        <w:t xml:space="preserve">Debrid-Link (DL)</w:t>
+        <w:t xml:space="preserve">TorBox (TB)</w:t>
       </w:r>
     </w:p>
     <w:p>
@@ -11716,7 +11693,7 @@
         <w:t xml:space="preserve"> </w:t>
       </w:r>
       <w:r>
-        <w:t xml:space="preserve">OAuth device code</w:t>
+        <w:t xml:space="preserve">API token input</w:t>
       </w:r>
     </w:p>
     <w:p>
@@ -11738,7 +11715,7 @@
         <w:t xml:space="preserve"> </w:t>
       </w:r>
       <w:r>
-        <w:t xml:space="preserve">Comet (your DL key) [+ MF if</w:t>
+        <w:t xml:space="preserve">Seedbox oracle (fetches</w:t>
       </w:r>
       <w:r>
         <w:t xml:space="preserve"> </w:t>
@@ -11747,13 +11724,22 @@
         <w:rPr>
           <w:rStyle w:val="VerbatimChar"/>
         </w:rPr>
-        <w:t xml:space="preserve">mf.service=0</w:t>
-      </w:r>
-      <w:r>
-        <w:t xml:space="preserve"> </w:t>
-      </w:r>
-      <w:r>
-        <w:t xml:space="preserve">— default]</w:t>
+        <w:t xml:space="preserve">/v2/seedbox/list</w:t>
+      </w:r>
+      <w:r>
+        <w:t xml:space="preserve"> </w:t>
+      </w:r>
+      <w:r>
+        <w:t xml:space="preserve">once per session, checks if hash is in your library); speculative probe (</w:t>
+      </w:r>
+      <w:r>
+        <w:rPr>
+          <w:rStyle w:val="VerbatimChar"/>
+        </w:rPr>
+        <w:t xml:space="preserve">async=true</w:t>
+      </w:r>
+      <w:r>
+        <w:t xml:space="preserve">) for near-instant cache detection</w:t>
       </w:r>
     </w:p>
     <w:p>
@@ -11775,7 +11761,7 @@
         <w:t xml:space="preserve"> </w:t>
       </w:r>
       <w:r>
-        <w:t xml:space="preserve">Yes</w:t>
+        <w:t xml:space="preserve">Yes — scans your TB seedbox</w:t>
       </w:r>
     </w:p>
     <w:p>
@@ -11819,7 +11805,7 @@
         <w:t xml:space="preserve"> </w:t>
       </w:r>
       <w:r>
-        <w:t xml:space="preserve">View active transfers</w:t>
+        <w:t xml:space="preserve">View active torrents/Usenet items</w:t>
       </w:r>
     </w:p>
     <w:p>
@@ -11835,22 +11821,13 @@
           <w:b/>
           <w:bCs/>
         </w:rPr>
-        <w:t xml:space="preserve">Speculative Probe:</w:t>
-      </w:r>
-      <w:r>
-        <w:t xml:space="preserve"> </w:t>
-      </w:r>
-      <w:r>
-        <w:rPr>
-          <w:rStyle w:val="VerbatimChar"/>
-        </w:rPr>
-        <w:t xml:space="preserve">/v2/seedbox/add async=true</w:t>
-      </w:r>
-      <w:r>
-        <w:t xml:space="preserve"> </w:t>
-      </w:r>
-      <w:r>
-        <w:t xml:space="preserve">— downloads 200ms, checks if instantly complete (= already cached)</w:t>
+        <w:t xml:space="preserve">Usenet search:</w:t>
+      </w:r>
+      <w:r>
+        <w:t xml:space="preserve"> </w:t>
+      </w:r>
+      <w:r>
+        <w:t xml:space="preserve">Built-in NZB scraper for TorBox Usenet accounts</w:t>
       </w:r>
     </w:p>
     <w:p>
@@ -11872,118 +11849,17 @@
         <w:t xml:space="preserve"> </w:t>
       </w:r>
       <w:r>
-        <w:t xml:space="preserve">Probe IDs cleaned up automatically on play or exit</w:t>
-      </w:r>
-    </w:p>
-    <w:p>
-      <w:pPr>
-        <w:pStyle w:val="Compact"/>
-        <w:numPr>
-          <w:ilvl w:val="0"/>
-          <w:numId w:val="1023"/>
-        </w:numPr>
-      </w:pPr>
-      <w:r>
-        <w:rPr>
-          <w:b/>
-          <w:bCs/>
-        </w:rPr>
-        <w:t xml:space="preserve">Account Info:</w:t>
-      </w:r>
-      <w:r>
-        <w:t xml:space="preserve"> </w:t>
-      </w:r>
-      <w:r>
-        <w:t xml:space="preserve">Shows account status and expiry</w:t>
+        <w:t xml:space="preserve">Auto-delete after watch</w:t>
       </w:r>
     </w:p>
     <w:bookmarkEnd w:id="100"/>
-    <w:bookmarkStart w:id="101" w:name="debrid-priority-order"/>
+    <w:bookmarkStart w:id="101" w:name="debrid-link-dl"/>
     <w:p>
       <w:pPr>
         <w:pStyle w:val="Heading3"/>
       </w:pPr>
       <w:r>
-        <w:t xml:space="preserve">Debrid Priority Order</w:t>
-      </w:r>
-    </w:p>
-    <w:p>
-      <w:pPr>
-        <w:pStyle w:val="FirstParagraph"/>
-      </w:pPr>
-      <w:r>
-        <w:t xml:space="preserve">When multiple debrid services are active and a torrent is cached on more than one, sources are offered in priority order:</w:t>
-      </w:r>
-      <w:r>
-        <w:t xml:space="preserve"> </w:t>
-      </w:r>
-      <w:r>
-        <w:rPr>
-          <w:b/>
-          <w:bCs/>
-        </w:rPr>
-        <w:t xml:space="preserve">PM → RD → AD → TB → DL</w:t>
-      </w:r>
-      <w:r>
-        <w:t xml:space="preserve"> </w:t>
-      </w:r>
-      <w:r>
-        <w:t xml:space="preserve">(user-configurable).</w:t>
-      </w:r>
-    </w:p>
-    <w:p>
-      <w:r>
-        <w:pict>
-          <v:rect style="width:0;height:1.5pt" o:hralign="center" o:hrstd="t" o:hr="t"/>
-        </w:pict>
-      </w:r>
-    </w:p>
-    <w:bookmarkEnd w:id="101"/>
-    <w:bookmarkEnd w:id="102"/>
-    <w:bookmarkStart w:id="103" w:name="my-files-cloud-browser"/>
-    <w:p>
-      <w:pPr>
-        <w:pStyle w:val="Heading2"/>
-      </w:pPr>
-      <w:r>
-        <w:t xml:space="preserve">12. My Files &amp; Cloud Browser</w:t>
-      </w:r>
-    </w:p>
-    <w:p>
-      <w:pPr>
-        <w:pStyle w:val="FirstParagraph"/>
-      </w:pPr>
-      <w:r>
-        <w:t xml:space="preserve">Each debrid service has a</w:t>
-      </w:r>
-      <w:r>
-        <w:t xml:space="preserve"> </w:t>
-      </w:r>
-      <w:r>
-        <w:rPr>
-          <w:b/>
-          <w:bCs/>
-        </w:rPr>
-        <w:t xml:space="preserve">My Files</w:t>
-      </w:r>
-      <w:r>
-        <w:t xml:space="preserve"> </w:t>
-      </w:r>
-      <w:r>
-        <w:t xml:space="preserve">browser accessible from</w:t>
-      </w:r>
-      <w:r>
-        <w:t xml:space="preserve"> </w:t>
-      </w:r>
-      <w:r>
-        <w:rPr>
-          <w:b/>
-          <w:bCs/>
-        </w:rPr>
-        <w:t xml:space="preserve">Debrid Services → [Service] My Files</w:t>
-      </w:r>
-      <w:r>
-        <w:t xml:space="preserve">. This lets you browse and play files already in your debrid cloud without scraping.</w:t>
+        <w:t xml:space="preserve">Debrid-Link (DL)</w:t>
       </w:r>
     </w:p>
     <w:p>
@@ -11995,7 +11871,17 @@
         </w:numPr>
       </w:pPr>
       <w:r>
-        <w:t xml:space="preserve">Browse folders and subfolders</w:t>
+        <w:rPr>
+          <w:b/>
+          <w:bCs/>
+        </w:rPr>
+        <w:t xml:space="preserve">Auth:</w:t>
+      </w:r>
+      <w:r>
+        <w:t xml:space="preserve"> </w:t>
+      </w:r>
+      <w:r>
+        <w:t xml:space="preserve">OAuth device code</w:t>
       </w:r>
     </w:p>
     <w:p>
@@ -12007,7 +11893,32 @@
         </w:numPr>
       </w:pPr>
       <w:r>
-        <w:t xml:space="preserve">Play video files directly</w:t>
+        <w:rPr>
+          <w:b/>
+          <w:bCs/>
+        </w:rPr>
+        <w:t xml:space="preserve">Cache Check:</w:t>
+      </w:r>
+      <w:r>
+        <w:t xml:space="preserve"> </w:t>
+      </w:r>
+      <w:r>
+        <w:t xml:space="preserve">Comet (your DL key) [+ MF if</w:t>
+      </w:r>
+      <w:r>
+        <w:t xml:space="preserve"> </w:t>
+      </w:r>
+      <w:r>
+        <w:rPr>
+          <w:rStyle w:val="VerbatimChar"/>
+        </w:rPr>
+        <w:t xml:space="preserve">mf.service=0</w:t>
+      </w:r>
+      <w:r>
+        <w:t xml:space="preserve"> </w:t>
+      </w:r>
+      <w:r>
+        <w:t xml:space="preserve">— default]</w:t>
       </w:r>
     </w:p>
     <w:p>
@@ -12019,7 +11930,170 @@
         </w:numPr>
       </w:pPr>
       <w:r>
-        <w:t xml:space="preserve">Navigate just like a local file browser</w:t>
+        <w:rPr>
+          <w:b/>
+          <w:bCs/>
+        </w:rPr>
+        <w:t xml:space="preserve">Cloud Scraper:</w:t>
+      </w:r>
+      <w:r>
+        <w:t xml:space="preserve"> </w:t>
+      </w:r>
+      <w:r>
+        <w:t xml:space="preserve">Yes</w:t>
+      </w:r>
+    </w:p>
+    <w:p>
+      <w:pPr>
+        <w:pStyle w:val="Compact"/>
+        <w:numPr>
+          <w:ilvl w:val="0"/>
+          <w:numId w:val="1024"/>
+        </w:numPr>
+      </w:pPr>
+      <w:r>
+        <w:rPr>
+          <w:b/>
+          <w:bCs/>
+        </w:rPr>
+        <w:t xml:space="preserve">My Files:</w:t>
+      </w:r>
+      <w:r>
+        <w:t xml:space="preserve"> </w:t>
+      </w:r>
+      <w:r>
+        <w:t xml:space="preserve">Full browser</w:t>
+      </w:r>
+    </w:p>
+    <w:p>
+      <w:pPr>
+        <w:pStyle w:val="Compact"/>
+        <w:numPr>
+          <w:ilvl w:val="0"/>
+          <w:numId w:val="1024"/>
+        </w:numPr>
+      </w:pPr>
+      <w:r>
+        <w:rPr>
+          <w:b/>
+          <w:bCs/>
+        </w:rPr>
+        <w:t xml:space="preserve">Transfers:</w:t>
+      </w:r>
+      <w:r>
+        <w:t xml:space="preserve"> </w:t>
+      </w:r>
+      <w:r>
+        <w:t xml:space="preserve">View active transfers</w:t>
+      </w:r>
+    </w:p>
+    <w:p>
+      <w:pPr>
+        <w:pStyle w:val="Compact"/>
+        <w:numPr>
+          <w:ilvl w:val="0"/>
+          <w:numId w:val="1024"/>
+        </w:numPr>
+      </w:pPr>
+      <w:r>
+        <w:rPr>
+          <w:b/>
+          <w:bCs/>
+        </w:rPr>
+        <w:t xml:space="preserve">Speculative Probe:</w:t>
+      </w:r>
+      <w:r>
+        <w:t xml:space="preserve"> </w:t>
+      </w:r>
+      <w:r>
+        <w:rPr>
+          <w:rStyle w:val="VerbatimChar"/>
+        </w:rPr>
+        <w:t xml:space="preserve">/v2/seedbox/add async=true</w:t>
+      </w:r>
+      <w:r>
+        <w:t xml:space="preserve"> </w:t>
+      </w:r>
+      <w:r>
+        <w:t xml:space="preserve">— downloads 200ms, checks if instantly complete (= already cached)</w:t>
+      </w:r>
+    </w:p>
+    <w:p>
+      <w:pPr>
+        <w:pStyle w:val="Compact"/>
+        <w:numPr>
+          <w:ilvl w:val="0"/>
+          <w:numId w:val="1024"/>
+        </w:numPr>
+      </w:pPr>
+      <w:r>
+        <w:rPr>
+          <w:b/>
+          <w:bCs/>
+        </w:rPr>
+        <w:t xml:space="preserve">Smart Delete:</w:t>
+      </w:r>
+      <w:r>
+        <w:t xml:space="preserve"> </w:t>
+      </w:r>
+      <w:r>
+        <w:t xml:space="preserve">Probe IDs cleaned up automatically on play or exit</w:t>
+      </w:r>
+    </w:p>
+    <w:p>
+      <w:pPr>
+        <w:pStyle w:val="Compact"/>
+        <w:numPr>
+          <w:ilvl w:val="0"/>
+          <w:numId w:val="1024"/>
+        </w:numPr>
+      </w:pPr>
+      <w:r>
+        <w:rPr>
+          <w:b/>
+          <w:bCs/>
+        </w:rPr>
+        <w:t xml:space="preserve">Account Info:</w:t>
+      </w:r>
+      <w:r>
+        <w:t xml:space="preserve"> </w:t>
+      </w:r>
+      <w:r>
+        <w:t xml:space="preserve">Shows account status and expiry</w:t>
+      </w:r>
+    </w:p>
+    <w:bookmarkEnd w:id="101"/>
+    <w:bookmarkStart w:id="102" w:name="debrid-priority-order"/>
+    <w:p>
+      <w:pPr>
+        <w:pStyle w:val="Heading3"/>
+      </w:pPr>
+      <w:r>
+        <w:t xml:space="preserve">Debrid Priority Order</w:t>
+      </w:r>
+    </w:p>
+    <w:p>
+      <w:pPr>
+        <w:pStyle w:val="FirstParagraph"/>
+      </w:pPr>
+      <w:r>
+        <w:t xml:space="preserve">When multiple debrid services are active and a torrent is cached on more than one, sources are offered in priority order:</w:t>
+      </w:r>
+      <w:r>
+        <w:t xml:space="preserve"> </w:t>
+      </w:r>
+      <w:r>
+        <w:rPr>
+          <w:b/>
+          <w:bCs/>
+        </w:rPr>
+        <w:t xml:space="preserve">PM → RD → AD → TB → DL</w:t>
+      </w:r>
+      <w:r>
+        <w:t xml:space="preserve"> </w:t>
+      </w:r>
+      <w:r>
+        <w:t xml:space="preserve">(user-configurable).</w:t>
       </w:r>
     </w:p>
     <w:p>
@@ -12029,23 +12103,15 @@
         </w:pict>
       </w:r>
     </w:p>
+    <w:bookmarkEnd w:id="102"/>
     <w:bookmarkEnd w:id="103"/>
-    <w:bookmarkStart w:id="112" w:name="provider-management"/>
+    <w:bookmarkStart w:id="104" w:name="my-files-cloud-browser"/>
     <w:p>
       <w:pPr>
         <w:pStyle w:val="Heading2"/>
       </w:pPr>
       <w:r>
-        <w:t xml:space="preserve">13. Provider Management</w:t>
-      </w:r>
-    </w:p>
-    <w:bookmarkStart w:id="104" w:name="installing-a-provider-package"/>
-    <w:p>
-      <w:pPr>
-        <w:pStyle w:val="Heading3"/>
-      </w:pPr>
-      <w:r>
-        <w:t xml:space="preserve">Installing a Provider Package</w:t>
+        <w:t xml:space="preserve">12. My Files &amp; Cloud Browser</w:t>
       </w:r>
     </w:p>
     <w:p>
@@ -12053,7 +12119,7 @@
         <w:pStyle w:val="FirstParagraph"/>
       </w:pPr>
       <w:r>
-        <w:t xml:space="preserve">Install a4kScrapers via Seren’s built-in package manager:</w:t>
+        <w:t xml:space="preserve">Each debrid service has a</w:t>
       </w:r>
       <w:r>
         <w:t xml:space="preserve"> </w:t>
@@ -12063,10 +12129,13 @@
           <w:b/>
           <w:bCs/>
         </w:rPr>
-        <w:t xml:space="preserve">Settings → Providers → Manage Providers → Install Provider Package</w:t>
-      </w:r>
-      <w:r>
-        <w:t xml:space="preserve">, then select</w:t>
+        <w:t xml:space="preserve">My Files</w:t>
+      </w:r>
+      <w:r>
+        <w:t xml:space="preserve"> </w:t>
+      </w:r>
+      <w:r>
+        <w:t xml:space="preserve">browser accessible from</w:t>
       </w:r>
       <w:r>
         <w:t xml:space="preserve"> </w:t>
@@ -12076,20 +12145,72 @@
           <w:b/>
           <w:bCs/>
         </w:rPr>
-        <w:t xml:space="preserve">a4kScrapers</w:t>
-      </w:r>
-      <w:r>
-        <w:t xml:space="preserve">. This is the recommended method — Seren handles the correct version automatically.</w:t>
+        <w:t xml:space="preserve">Debrid Services → [Service] My Files</w:t>
+      </w:r>
+      <w:r>
+        <w:t xml:space="preserve">. This lets you browse and play files already in your debrid cloud without scraping.</w:t>
+      </w:r>
+    </w:p>
+    <w:p>
+      <w:pPr>
+        <w:pStyle w:val="Compact"/>
+        <w:numPr>
+          <w:ilvl w:val="0"/>
+          <w:numId w:val="1025"/>
+        </w:numPr>
+      </w:pPr>
+      <w:r>
+        <w:t xml:space="preserve">Browse folders and subfolders</w:t>
+      </w:r>
+    </w:p>
+    <w:p>
+      <w:pPr>
+        <w:pStyle w:val="Compact"/>
+        <w:numPr>
+          <w:ilvl w:val="0"/>
+          <w:numId w:val="1025"/>
+        </w:numPr>
+      </w:pPr>
+      <w:r>
+        <w:t xml:space="preserve">Play video files directly</w:t>
+      </w:r>
+    </w:p>
+    <w:p>
+      <w:pPr>
+        <w:pStyle w:val="Compact"/>
+        <w:numPr>
+          <w:ilvl w:val="0"/>
+          <w:numId w:val="1025"/>
+        </w:numPr>
+      </w:pPr>
+      <w:r>
+        <w:t xml:space="preserve">Navigate just like a local file browser</w:t>
+      </w:r>
+    </w:p>
+    <w:p>
+      <w:r>
+        <w:pict>
+          <v:rect style="width:0;height:1.5pt" o:hralign="center" o:hrstd="t" o:hr="t"/>
+        </w:pict>
       </w:r>
     </w:p>
     <w:bookmarkEnd w:id="104"/>
-    <w:bookmarkStart w:id="105" w:name="provider-tiers"/>
+    <w:bookmarkStart w:id="113" w:name="provider-management"/>
+    <w:p>
+      <w:pPr>
+        <w:pStyle w:val="Heading2"/>
+      </w:pPr>
+      <w:r>
+        <w:t xml:space="preserve">13. Provider Management</w:t>
+      </w:r>
+    </w:p>
+    <w:bookmarkStart w:id="105" w:name="installing-a-provider-package"/>
     <w:p>
       <w:pPr>
         <w:pStyle w:val="Heading3"/>
       </w:pPr>
       <w:r>
-        <w:t xml:space="preserve">Provider Tiers</w:t>
+        <w:t xml:space="preserve">Installing a Provider Package</w:t>
       </w:r>
     </w:p>
     <w:p>
@@ -12097,40 +12218,7 @@
         <w:pStyle w:val="FirstParagraph"/>
       </w:pPr>
       <w:r>
-        <w:t xml:space="preserve">Installed providers are automatically assigned to scraping tiers (0–7) based on their name. The tier assignment is defined in</w:t>
-      </w:r>
-      <w:r>
-        <w:t xml:space="preserve"> </w:t>
-      </w:r>
-      <w:r>
-        <w:rPr>
-          <w:rStyle w:val="VerbatimChar"/>
-        </w:rPr>
-        <w:t xml:space="preserve">getSources.py</w:t>
-      </w:r>
-      <w:r>
-        <w:t xml:space="preserve"> </w:t>
-      </w:r>
-      <w:r>
-        <w:t xml:space="preserve">within Seren.</w:t>
-      </w:r>
-    </w:p>
-    <w:bookmarkEnd w:id="105"/>
-    <w:bookmarkStart w:id="106" w:name="per-tier-toggles"/>
-    <w:p>
-      <w:pPr>
-        <w:pStyle w:val="Heading3"/>
-      </w:pPr>
-      <w:r>
-        <w:t xml:space="preserve">Per-Tier Toggles</w:t>
-      </w:r>
-    </w:p>
-    <w:p>
-      <w:pPr>
-        <w:pStyle w:val="FirstParagraph"/>
-      </w:pPr>
-      <w:r>
-        <w:t xml:space="preserve">Each of the 8 tiers (0–7) can be individually enabled or disabled in</w:t>
+        <w:t xml:space="preserve">Install a4kScrapers via Seren’s built-in package manager:</w:t>
       </w:r>
       <w:r>
         <w:t xml:space="preserve"> </w:t>
@@ -12140,14 +12228,91 @@
           <w:b/>
           <w:bCs/>
         </w:rPr>
+        <w:t xml:space="preserve">Settings → Providers → Manage Providers → Install Provider Package</w:t>
+      </w:r>
+      <w:r>
+        <w:t xml:space="preserve">, then select</w:t>
+      </w:r>
+      <w:r>
+        <w:t xml:space="preserve"> </w:t>
+      </w:r>
+      <w:r>
+        <w:rPr>
+          <w:b/>
+          <w:bCs/>
+        </w:rPr>
+        <w:t xml:space="preserve">a4kScrapers</w:t>
+      </w:r>
+      <w:r>
+        <w:t xml:space="preserve">. This is the recommended method — Seren handles the correct version automatically.</w:t>
+      </w:r>
+    </w:p>
+    <w:bookmarkEnd w:id="105"/>
+    <w:bookmarkStart w:id="106" w:name="provider-tiers"/>
+    <w:p>
+      <w:pPr>
+        <w:pStyle w:val="Heading3"/>
+      </w:pPr>
+      <w:r>
+        <w:t xml:space="preserve">Provider Tiers</w:t>
+      </w:r>
+    </w:p>
+    <w:p>
+      <w:pPr>
+        <w:pStyle w:val="FirstParagraph"/>
+      </w:pPr>
+      <w:r>
+        <w:t xml:space="preserve">Installed providers are automatically assigned to scraping tiers (0–7) based on their name. The tier assignment is defined in</w:t>
+      </w:r>
+      <w:r>
+        <w:t xml:space="preserve"> </w:t>
+      </w:r>
+      <w:r>
+        <w:rPr>
+          <w:rStyle w:val="VerbatimChar"/>
+        </w:rPr>
+        <w:t xml:space="preserve">getSources.py</w:t>
+      </w:r>
+      <w:r>
+        <w:t xml:space="preserve"> </w:t>
+      </w:r>
+      <w:r>
+        <w:t xml:space="preserve">within Seren.</w:t>
+      </w:r>
+    </w:p>
+    <w:bookmarkEnd w:id="106"/>
+    <w:bookmarkStart w:id="107" w:name="per-tier-toggles"/>
+    <w:p>
+      <w:pPr>
+        <w:pStyle w:val="Heading3"/>
+      </w:pPr>
+      <w:r>
+        <w:t xml:space="preserve">Per-Tier Toggles</w:t>
+      </w:r>
+    </w:p>
+    <w:p>
+      <w:pPr>
+        <w:pStyle w:val="FirstParagraph"/>
+      </w:pPr>
+      <w:r>
+        <w:t xml:space="preserve">Each of the 8 tiers (0–7) can be individually enabled or disabled in</w:t>
+      </w:r>
+      <w:r>
+        <w:t xml:space="preserve"> </w:t>
+      </w:r>
+      <w:r>
+        <w:rPr>
+          <w:b/>
+          <w:bCs/>
+        </w:rPr>
         <w:t xml:space="preserve">Settings → Providers</w:t>
       </w:r>
       <w:r>
         <w:t xml:space="preserve">. Disabling Tier 1 skips all anime scrapers entirely (useful for non-anime users). Disabling Tiers 6 and 7 is recommended on fast connections where Tiers 0–5 consistently find enough cached sources.</w:t>
       </w:r>
     </w:p>
-    <w:bookmarkEnd w:id="106"/>
-    <w:bookmarkStart w:id="107" w:name="orion-orionoid-toggles"/>
+    <w:bookmarkEnd w:id="107"/>
+    <w:bookmarkStart w:id="108" w:name="orion-orionoid-toggles"/>
     <w:p>
       <w:pPr>
         <w:pStyle w:val="Heading3"/>
@@ -12316,8 +12481,8 @@
         <w:t xml:space="preserve">) must also be on for Orion’s torrent sources to run.</w:t>
       </w:r>
     </w:p>
-    <w:bookmarkEnd w:id="107"/>
-    <w:bookmarkStart w:id="108" w:name="tier-skip-threshold"/>
+    <w:bookmarkEnd w:id="108"/>
+    <w:bookmarkStart w:id="109" w:name="tier-skip-threshold"/>
     <w:p>
       <w:pPr>
         <w:pStyle w:val="Heading3"/>
@@ -12344,8 +12509,8 @@
         <w:t xml:space="preserve">(default: 10). If this many cached sources are found after completing a tier, remaining tiers are skipped. Set to 0 to disable early exit (always run all tiers).</w:t>
       </w:r>
     </w:p>
-    <w:bookmarkEnd w:id="108"/>
-    <w:bookmarkStart w:id="109" w:name="provider-performance-learning"/>
+    <w:bookmarkEnd w:id="109"/>
+    <w:bookmarkStart w:id="110" w:name="provider-performance-learning"/>
     <w:p>
       <w:pPr>
         <w:pStyle w:val="Heading3"/>
@@ -12504,8 +12669,8 @@
         <w:t xml:space="preserve">(skipped entirely). You can re-enable them manually.</w:t>
       </w:r>
     </w:p>
-    <w:bookmarkEnd w:id="109"/>
-    <w:bookmarkStart w:id="110" w:name="provider-package-services"/>
+    <w:bookmarkEnd w:id="110"/>
+    <w:bookmarkStart w:id="111" w:name="provider-package-services"/>
     <w:p>
       <w:pPr>
         <w:pStyle w:val="Heading3"/>
@@ -12538,8 +12703,8 @@
         <w:t xml:space="preserve">keeps these running.</w:t>
       </w:r>
     </w:p>
-    <w:bookmarkEnd w:id="110"/>
-    <w:bookmarkStart w:id="111" w:name="easynews-usenet-a4knewsgroups"/>
+    <w:bookmarkEnd w:id="111"/>
+    <w:bookmarkStart w:id="112" w:name="easynews-usenet-a4knewsgroups"/>
     <w:p>
       <w:pPr>
         <w:pStyle w:val="Heading3"/>
@@ -12922,9 +13087,9 @@
         </w:pict>
       </w:r>
     </w:p>
-    <w:bookmarkEnd w:id="111"/>
     <w:bookmarkEnd w:id="112"/>
-    <w:bookmarkStart w:id="123" w:name="database-cache-management"/>
+    <w:bookmarkEnd w:id="113"/>
+    <w:bookmarkStart w:id="124" w:name="database-cache-management"/>
     <w:p>
       <w:pPr>
         <w:pStyle w:val="Heading2"/>
@@ -12933,7 +13098,7 @@
         <w:t xml:space="preserve">14. Database &amp; Cache Management</w:t>
       </w:r>
     </w:p>
-    <w:bookmarkStart w:id="113" w:name="torrent-cache"/>
+    <w:bookmarkStart w:id="114" w:name="torrent-cache"/>
     <w:p>
       <w:pPr>
         <w:pStyle w:val="Heading3"/>
@@ -12955,7 +13120,7 @@
         <w:pStyle w:val="Compact"/>
         <w:numPr>
           <w:ilvl w:val="0"/>
-          <w:numId w:val="1025"/>
+          <w:numId w:val="1026"/>
         </w:numPr>
       </w:pPr>
       <w:r>
@@ -12977,7 +13142,7 @@
         <w:pStyle w:val="Compact"/>
         <w:numPr>
           <w:ilvl w:val="0"/>
-          <w:numId w:val="1025"/>
+          <w:numId w:val="1026"/>
         </w:numPr>
       </w:pPr>
       <w:r>
@@ -12999,7 +13164,7 @@
         <w:pStyle w:val="Compact"/>
         <w:numPr>
           <w:ilvl w:val="0"/>
-          <w:numId w:val="1025"/>
+          <w:numId w:val="1026"/>
         </w:numPr>
       </w:pPr>
       <w:r>
@@ -13016,8 +13181,8 @@
         <w:t xml:space="preserve">50MB — oldest entries removed first when exceeded</w:t>
       </w:r>
     </w:p>
-    <w:bookmarkEnd w:id="113"/>
-    <w:bookmarkStart w:id="114" w:name="debrid-cache"/>
+    <w:bookmarkEnd w:id="114"/>
+    <w:bookmarkStart w:id="115" w:name="debrid-cache"/>
     <w:p>
       <w:pPr>
         <w:pStyle w:val="Heading3"/>
@@ -13034,8 +13199,8 @@
         <w:t xml:space="preserve">Stores which hashes have been confirmed cached on which debrid service. TTL varies by service.</w:t>
       </w:r>
     </w:p>
-    <w:bookmarkEnd w:id="114"/>
-    <w:bookmarkStart w:id="115" w:name="torrent-assist-cache"/>
+    <w:bookmarkEnd w:id="115"/>
+    <w:bookmarkStart w:id="116" w:name="torrent-assist-cache"/>
     <w:p>
       <w:pPr>
         <w:pStyle w:val="Heading3"/>
@@ -13052,8 +13217,8 @@
         <w:t xml:space="preserve">Tracks manually cached torrents. Cleared separately from the main torrent cache.</w:t>
       </w:r>
     </w:p>
-    <w:bookmarkEnd w:id="115"/>
-    <w:bookmarkStart w:id="116" w:name="provider-cache"/>
+    <w:bookmarkEnd w:id="116"/>
+    <w:bookmarkStart w:id="117" w:name="provider-cache"/>
     <w:p>
       <w:pPr>
         <w:pStyle w:val="Heading3"/>
@@ -13070,8 +13235,8 @@
         <w:t xml:space="preserve">Stores the list of known providers and their availability.</w:t>
       </w:r>
     </w:p>
-    <w:bookmarkEnd w:id="116"/>
-    <w:bookmarkStart w:id="117" w:name="provider-performance-database"/>
+    <w:bookmarkEnd w:id="117"/>
+    <w:bookmarkStart w:id="118" w:name="provider-performance-database"/>
     <w:p>
       <w:pPr>
         <w:pStyle w:val="Heading3"/>
@@ -13088,8 +13253,8 @@
         <w:t xml:space="preserve">SQLite database of scraping performance metrics per provider. Updated after every scrape.</w:t>
       </w:r>
     </w:p>
-    <w:bookmarkEnd w:id="117"/>
-    <w:bookmarkStart w:id="118" w:name="anime-cache"/>
+    <w:bookmarkEnd w:id="118"/>
+    <w:bookmarkStart w:id="119" w:name="anime-cache"/>
     <w:p>
       <w:pPr>
         <w:pStyle w:val="Heading3"/>
@@ -13130,8 +13295,8 @@
         <w:t xml:space="preserve">, and episode timing data.</w:t>
       </w:r>
     </w:p>
-    <w:bookmarkEnd w:id="118"/>
-    <w:bookmarkStart w:id="119" w:name="trakt-sync-database"/>
+    <w:bookmarkEnd w:id="119"/>
+    <w:bookmarkStart w:id="120" w:name="trakt-sync-database"/>
     <w:p>
       <w:pPr>
         <w:pStyle w:val="Heading3"/>
@@ -13148,8 +13313,8 @@
         <w:t xml:space="preserve">Full local copy of your Trakt watch state — movies, shows, seasons, episodes, bookmarks, ratings, hidden items, lists. Synced in the background.</w:t>
       </w:r>
     </w:p>
-    <w:bookmarkEnd w:id="119"/>
-    <w:bookmarkStart w:id="120" w:name="search-history"/>
+    <w:bookmarkEnd w:id="120"/>
+    <w:bookmarkStart w:id="121" w:name="search-history"/>
     <w:p>
       <w:pPr>
         <w:pStyle w:val="Heading3"/>
@@ -13166,8 +13331,8 @@
         <w:t xml:space="preserve">Saved per media type (movies, shows). Viewable, removable individually, or clearable all at once.</w:t>
       </w:r>
     </w:p>
-    <w:bookmarkEnd w:id="120"/>
-    <w:bookmarkStart w:id="121" w:name="title-substitutions-database"/>
+    <w:bookmarkEnd w:id="121"/>
+    <w:bookmarkStart w:id="122" w:name="title-substitutions-database"/>
     <w:p>
       <w:pPr>
         <w:pStyle w:val="Heading3"/>
@@ -13197,8 +13362,8 @@
         <w:t xml:space="preserve">.</w:t>
       </w:r>
     </w:p>
-    <w:bookmarkEnd w:id="121"/>
-    <w:bookmarkStart w:id="122" w:name="undesirables-database"/>
+    <w:bookmarkEnd w:id="122"/>
+    <w:bookmarkStart w:id="123" w:name="undesirables-database"/>
     <w:p>
       <w:pPr>
         <w:pStyle w:val="Heading3"/>
@@ -13235,9 +13400,9 @@
         </w:pict>
       </w:r>
     </w:p>
-    <w:bookmarkEnd w:id="122"/>
     <w:bookmarkEnd w:id="123"/>
-    <w:bookmarkStart w:id="128" w:name="trakt-integration"/>
+    <w:bookmarkEnd w:id="124"/>
+    <w:bookmarkStart w:id="129" w:name="trakt-integration"/>
     <w:p>
       <w:pPr>
         <w:pStyle w:val="Heading2"/>
@@ -13254,7 +13419,7 @@
         <w:t xml:space="preserve">Seren is tightly integrated with Trakt.tv for all watch-state management.</w:t>
       </w:r>
     </w:p>
-    <w:bookmarkStart w:id="124" w:name="enable-disable-trakt"/>
+    <w:bookmarkStart w:id="125" w:name="enable-disable-trakt"/>
     <w:p>
       <w:pPr>
         <w:pStyle w:val="Heading3"/>
@@ -13287,8 +13452,8 @@
         <w:t xml:space="preserve">(default: on). Turning it off hides every Trakt-driven menu and context-menu entry without revoking your saved login — turn it back on and everything reappears immediately, including on first load without needing to reopen Settings.</w:t>
       </w:r>
     </w:p>
-    <w:bookmarkEnd w:id="124"/>
-    <w:bookmarkStart w:id="125" w:name="sync-features"/>
+    <w:bookmarkEnd w:id="125"/>
+    <w:bookmarkStart w:id="126" w:name="sync-features"/>
     <w:p>
       <w:pPr>
         <w:pStyle w:val="Heading3"/>
@@ -13538,8 +13703,8 @@
         </w:tc>
       </w:tr>
     </w:tbl>
-    <w:bookmarkEnd w:id="125"/>
-    <w:bookmarkStart w:id="126" w:name="sync-operations"/>
+    <w:bookmarkEnd w:id="126"/>
+    <w:bookmarkStart w:id="127" w:name="sync-operations"/>
     <w:p>
       <w:pPr>
         <w:pStyle w:val="Heading3"/>
@@ -13641,8 +13806,8 @@
         <w:t xml:space="preserve">menu (Sync Activities / Flush Activities / Clean Orphaned Metadata) no longer exists — it was replaced by the shared Sync Tools menu above.</w:t>
       </w:r>
     </w:p>
-    <w:bookmarkEnd w:id="126"/>
-    <w:bookmarkStart w:id="127" w:name="trakt-context-menu"/>
+    <w:bookmarkEnd w:id="127"/>
+    <w:bookmarkStart w:id="128" w:name="trakt-context-menu"/>
     <w:p>
       <w:pPr>
         <w:pStyle w:val="Heading3"/>
@@ -13702,9 +13867,9 @@
         </w:pict>
       </w:r>
     </w:p>
-    <w:bookmarkEnd w:id="127"/>
     <w:bookmarkEnd w:id="128"/>
-    <w:bookmarkStart w:id="138" w:name="mdblist-integration"/>
+    <w:bookmarkEnd w:id="129"/>
+    <w:bookmarkStart w:id="139" w:name="mdblist-integration"/>
     <w:p>
       <w:pPr>
         <w:pStyle w:val="Heading2"/>
@@ -13733,7 +13898,7 @@
         <w:t xml:space="preserve">menus (Section 6) combine them into one deduplicated view.</w:t>
       </w:r>
     </w:p>
-    <w:bookmarkStart w:id="129" w:name="setup"/>
+    <w:bookmarkStart w:id="130" w:name="setup"/>
     <w:p>
       <w:pPr>
         <w:pStyle w:val="Heading3"/>
@@ -13993,8 +14158,8 @@
         <w:t xml:space="preserve">MDBList’s scrobble settings are entirely separate from Trakt’s — running both services at once, you can tune each independently.</w:t>
       </w:r>
     </w:p>
-    <w:bookmarkEnd w:id="129"/>
-    <w:bookmarkStart w:id="130" w:name="sync-features-1"/>
+    <w:bookmarkEnd w:id="130"/>
+    <w:bookmarkStart w:id="131" w:name="sync-features-1"/>
     <w:p>
       <w:pPr>
         <w:pStyle w:val="Heading3"/>
@@ -14172,8 +14337,8 @@
         </w:tc>
       </w:tr>
     </w:tbl>
-    <w:bookmarkEnd w:id="130"/>
-    <w:bookmarkStart w:id="131" w:name="browsing-menus"/>
+    <w:bookmarkEnd w:id="131"/>
+    <w:bookmarkStart w:id="132" w:name="browsing-menus"/>
     <w:p>
       <w:pPr>
         <w:pStyle w:val="Heading3"/>
@@ -14231,8 +14396,8 @@
         <w:t xml:space="preserve">entries.</w:t>
       </w:r>
     </w:p>
-    <w:bookmarkEnd w:id="131"/>
-    <w:bookmarkStart w:id="132" w:name="collection-dropped-menus"/>
+    <w:bookmarkEnd w:id="132"/>
+    <w:bookmarkStart w:id="133" w:name="collection-dropped-menus"/>
     <w:p>
       <w:pPr>
         <w:pStyle w:val="Heading3"/>
@@ -14335,8 +14500,8 @@
         <w:t xml:space="preserve">There’s no Dropped Movies menu — MDBList’s API only supports a dropped-items list for shows, not movies.</w:t>
       </w:r>
     </w:p>
-    <w:bookmarkEnd w:id="132"/>
-    <w:bookmarkStart w:id="133" w:name="my-lists"/>
+    <w:bookmarkEnd w:id="133"/>
+    <w:bookmarkStart w:id="134" w:name="my-lists"/>
     <w:p>
       <w:pPr>
         <w:pStyle w:val="Heading3"/>
@@ -14613,8 +14778,8 @@
         <w:t xml:space="preserve">(static lists only — MDBList doesn’t allow deleting dynamic lists)</w:t>
       </w:r>
     </w:p>
-    <w:bookmarkEnd w:id="133"/>
-    <w:bookmarkStart w:id="134" w:name="add-to-list-remove-from-list"/>
+    <w:bookmarkEnd w:id="134"/>
+    <w:bookmarkStart w:id="135" w:name="add-to-list-remove-from-list"/>
     <w:p>
       <w:pPr>
         <w:pStyle w:val="Heading3"/>
@@ -14712,8 +14877,8 @@
         <w:t xml:space="preserve">Both add and remove target static lists only (MDBList’s write API doesn’t support adding items to dynamic lists). If you’ve hit MDBList’s static-list count limit, list creation fails with a clear message rather than a silent error.</w:t>
       </w:r>
     </w:p>
-    <w:bookmarkEnd w:id="134"/>
-    <w:bookmarkStart w:id="135" w:name="discover-public-lists"/>
+    <w:bookmarkEnd w:id="135"/>
+    <w:bookmarkStart w:id="136" w:name="discover-public-lists"/>
     <w:p>
       <w:pPr>
         <w:pStyle w:val="Heading3"/>
@@ -14804,8 +14969,8 @@
         <w:t xml:space="preserve">Opening a discovered list works exactly like opening your own — same sort/filter controls, same playback path.</w:t>
       </w:r>
     </w:p>
-    <w:bookmarkEnd w:id="135"/>
-    <w:bookmarkStart w:id="136" w:name="mdblist-context-menu"/>
+    <w:bookmarkEnd w:id="136"/>
+    <w:bookmarkStart w:id="137" w:name="mdblist-context-menu"/>
     <w:p>
       <w:pPr>
         <w:pStyle w:val="Heading3"/>
@@ -14921,8 +15086,8 @@
         <w:t xml:space="preserve">- Manage Lists (rename / privacy / delete — static lists)</w:t>
       </w:r>
     </w:p>
-    <w:bookmarkEnd w:id="136"/>
-    <w:bookmarkStart w:id="137" w:name="known-limitations"/>
+    <w:bookmarkEnd w:id="137"/>
+    <w:bookmarkStart w:id="138" w:name="known-limitations"/>
     <w:p>
       <w:pPr>
         <w:pStyle w:val="Heading3"/>
@@ -14936,7 +15101,7 @@
         <w:pStyle w:val="Compact"/>
         <w:numPr>
           <w:ilvl w:val="0"/>
-          <w:numId w:val="1026"/>
+          <w:numId w:val="1027"/>
         </w:numPr>
       </w:pPr>
       <w:r>
@@ -14948,7 +15113,7 @@
         <w:pStyle w:val="Compact"/>
         <w:numPr>
           <w:ilvl w:val="0"/>
-          <w:numId w:val="1026"/>
+          <w:numId w:val="1027"/>
         </w:numPr>
       </w:pPr>
       <w:r>
@@ -14972,7 +15137,7 @@
         <w:pStyle w:val="Compact"/>
         <w:numPr>
           <w:ilvl w:val="0"/>
-          <w:numId w:val="1026"/>
+          <w:numId w:val="1027"/>
         </w:numPr>
       </w:pPr>
       <w:r>
@@ -14984,7 +15149,7 @@
         <w:pStyle w:val="Compact"/>
         <w:numPr>
           <w:ilvl w:val="0"/>
-          <w:numId w:val="1026"/>
+          <w:numId w:val="1027"/>
         </w:numPr>
       </w:pPr>
       <w:r>
@@ -15013,9 +15178,9 @@
         </w:pict>
       </w:r>
     </w:p>
-    <w:bookmarkEnd w:id="137"/>
     <w:bookmarkEnd w:id="138"/>
-    <w:bookmarkStart w:id="144" w:name="simkl-integration"/>
+    <w:bookmarkEnd w:id="139"/>
+    <w:bookmarkStart w:id="145" w:name="simkl-integration"/>
     <w:p>
       <w:pPr>
         <w:pStyle w:val="Heading2"/>
@@ -15044,7 +15209,7 @@
         <w:t xml:space="preserve">menus (Section 6) combine them into one deduplicated view. Unlike Trakt and MDBList, Simkl has no custom list-management feature — its tracking model is built around status buckets (Plan to Watch/Watching/On Hold/Completed/Dropped) instead.</w:t>
       </w:r>
     </w:p>
-    <w:bookmarkStart w:id="139" w:name="setup-1"/>
+    <w:bookmarkStart w:id="140" w:name="setup-1"/>
     <w:p>
       <w:pPr>
         <w:pStyle w:val="Heading3"/>
@@ -15304,8 +15469,8 @@
         <w:t xml:space="preserve">Simkl’s scrobble settings are entirely separate from Trakt’s and MDBList’s — running multiple services at once, you can tune each independently.</w:t>
       </w:r>
     </w:p>
-    <w:bookmarkEnd w:id="139"/>
-    <w:bookmarkStart w:id="140" w:name="sync-features-2"/>
+    <w:bookmarkEnd w:id="140"/>
+    <w:bookmarkStart w:id="141" w:name="sync-features-2"/>
     <w:p>
       <w:pPr>
         <w:pStyle w:val="Heading3"/>
@@ -15468,8 +15633,8 @@
         </w:tc>
       </w:tr>
     </w:tbl>
-    <w:bookmarkEnd w:id="140"/>
-    <w:bookmarkStart w:id="141" w:name="browsing-menus-1"/>
+    <w:bookmarkEnd w:id="141"/>
+    <w:bookmarkStart w:id="142" w:name="browsing-menus-1"/>
     <w:p>
       <w:pPr>
         <w:pStyle w:val="Heading3"/>
@@ -15547,8 +15712,8 @@
         <w:t xml:space="preserve">for shows.</w:t>
       </w:r>
     </w:p>
-    <w:bookmarkEnd w:id="141"/>
-    <w:bookmarkStart w:id="142" w:name="simkl-context-menu"/>
+    <w:bookmarkEnd w:id="142"/>
+    <w:bookmarkStart w:id="143" w:name="simkl-context-menu"/>
     <w:p>
       <w:pPr>
         <w:pStyle w:val="Heading3"/>
@@ -15634,115 +15799,14 @@
         <w:t xml:space="preserve">- Clear Progress</w:t>
       </w:r>
     </w:p>
-    <w:bookmarkEnd w:id="142"/>
-    <w:bookmarkStart w:id="143" w:name="known-limitations-1"/>
+    <w:bookmarkEnd w:id="143"/>
+    <w:bookmarkStart w:id="144" w:name="known-limitations-1"/>
     <w:p>
       <w:pPr>
         <w:pStyle w:val="Heading3"/>
       </w:pPr>
       <w:r>
         <w:t xml:space="preserve">Known Limitations</w:t>
-      </w:r>
-    </w:p>
-    <w:p>
-      <w:pPr>
-        <w:pStyle w:val="Compact"/>
-        <w:numPr>
-          <w:ilvl w:val="0"/>
-          <w:numId w:val="1027"/>
-        </w:numPr>
-      </w:pPr>
-      <w:r>
-        <w:t xml:space="preserve">No custom list-management feature — no equivalent to Trakt Lists or MDBList Lists; the status-bucket menus above are the closest equivalent.</w:t>
-      </w:r>
-    </w:p>
-    <w:p>
-      <w:pPr>
-        <w:pStyle w:val="Compact"/>
-        <w:numPr>
-          <w:ilvl w:val="0"/>
-          <w:numId w:val="1027"/>
-        </w:numPr>
-      </w:pPr>
-      <w:r>
-        <w:t xml:space="preserve">No Favorites equivalent — Favorites (Section 15) is Trakt-only.</w:t>
-      </w:r>
-    </w:p>
-    <w:p>
-      <w:pPr>
-        <w:pStyle w:val="Compact"/>
-        <w:numPr>
-          <w:ilvl w:val="0"/>
-          <w:numId w:val="1027"/>
-        </w:numPr>
-      </w:pPr>
-      <w:r>
-        <w:t xml:space="preserve">No</w:t>
-      </w:r>
-      <w:r>
-        <w:t xml:space="preserve"> </w:t>
-      </w:r>
-      <w:r>
-        <w:t xml:space="preserve">“Liked Lists”</w:t>
-      </w:r>
-      <w:r>
-        <w:t xml:space="preserve"> </w:t>
-      </w:r>
-      <w:r>
-        <w:t xml:space="preserve">equivalent.</w:t>
-      </w:r>
-    </w:p>
-    <w:p>
-      <w:pPr>
-        <w:pStyle w:val="Compact"/>
-        <w:numPr>
-          <w:ilvl w:val="0"/>
-          <w:numId w:val="1027"/>
-        </w:numPr>
-      </w:pPr>
-      <w:r>
-        <w:t xml:space="preserve">Simkl keeps only one paused playback per show/movie at a time — resuming a different episode of the same show replaces the previous pause position. This is documented Simkl API behavior, not a Seren limitation.</w:t>
-      </w:r>
-    </w:p>
-    <w:p>
-      <w:r>
-        <w:pict>
-          <v:rect style="width:0;height:1.5pt" o:hralign="center" o:hrstd="t" o:hr="t"/>
-        </w:pict>
-      </w:r>
-    </w:p>
-    <w:bookmarkEnd w:id="143"/>
-    <w:bookmarkEnd w:id="144"/>
-    <w:bookmarkStart w:id="148" w:name="cross-service-sync"/>
-    <w:p>
-      <w:pPr>
-        <w:pStyle w:val="Heading2"/>
-      </w:pPr>
-      <w:r>
-        <w:t xml:space="preserve">18. Cross-Service Sync</w:t>
-      </w:r>
-    </w:p>
-    <w:p>
-      <w:pPr>
-        <w:pStyle w:val="FirstParagraph"/>
-      </w:pPr>
-      <w:r>
-        <w:t xml:space="preserve">Trakt, MDBList, and Simkl mirror each other automatically once 2 or more are connected — a background bridge that keeps watch status, ratings, watchlist, and collection consistent across whichever services you use, without needing to pick one as</w:t>
-      </w:r>
-      <w:r>
-        <w:t xml:space="preserve"> </w:t>
-      </w:r>
-      <w:r>
-        <w:t xml:space="preserve">“primary.”</w:t>
-      </w:r>
-    </w:p>
-    <w:bookmarkStart w:id="145" w:name="what-it-does"/>
-    <w:p>
-      <w:pPr>
-        <w:pStyle w:val="Heading3"/>
-      </w:pPr>
-      <w:r>
-        <w:t xml:space="preserve">What It Does</w:t>
       </w:r>
     </w:p>
     <w:p>
@@ -15754,17 +15818,7 @@
         </w:numPr>
       </w:pPr>
       <w:r>
-        <w:rPr>
-          <w:b/>
-          <w:bCs/>
-        </w:rPr>
-        <w:t xml:space="preserve">Instant push</w:t>
-      </w:r>
-      <w:r>
-        <w:t xml:space="preserve"> </w:t>
-      </w:r>
-      <w:r>
-        <w:t xml:space="preserve">— marking watched/unwatched, rating, or adding to watchlist/collection from any one service’s context menu (Trakt Manager, MDBList Manager, or Simkl Manager) immediately pushes the same change to the other connected services.</w:t>
+        <w:t xml:space="preserve">No custom list-management feature — no equivalent to Trakt Lists or MDBList Lists; the status-bucket menus above are the closest equivalent.</w:t>
       </w:r>
     </w:p>
     <w:p>
@@ -15776,17 +15830,7 @@
         </w:numPr>
       </w:pPr>
       <w:r>
-        <w:rPr>
-          <w:b/>
-          <w:bCs/>
-        </w:rPr>
-        <w:t xml:space="preserve">Background reconciliation</w:t>
-      </w:r>
-      <w:r>
-        <w:t xml:space="preserve"> </w:t>
-      </w:r>
-      <w:r>
-        <w:t xml:space="preserve">— roughly every 15 minutes, a background bridge checks each connected service’s own site/app for changes made directly there (outside Seren) and mirrors them across the others.</w:t>
+        <w:t xml:space="preserve">No Favorites equivalent — Favorites (Section 15) is Trakt-only.</w:t>
       </w:r>
     </w:p>
     <w:p>
@@ -15798,55 +15842,72 @@
         </w:numPr>
       </w:pPr>
       <w:r>
-        <w:rPr>
-          <w:b/>
-          <w:bCs/>
-        </w:rPr>
-        <w:t xml:space="preserve">Works without Trakt</w:t>
-      </w:r>
-      <w:r>
-        <w:t xml:space="preserve"> </w:t>
-      </w:r>
-      <w:r>
-        <w:t xml:space="preserve">— the bridge doesn’t require Trakt to be connected; any 2 of the 3 services trigger it.</w:t>
-      </w:r>
-    </w:p>
+        <w:t xml:space="preserve">No</w:t>
+      </w:r>
+      <w:r>
+        <w:t xml:space="preserve"> </w:t>
+      </w:r>
+      <w:r>
+        <w:t xml:space="preserve">“Liked Lists”</w:t>
+      </w:r>
+      <w:r>
+        <w:t xml:space="preserve"> </w:t>
+      </w:r>
+      <w:r>
+        <w:t xml:space="preserve">equivalent.</w:t>
+      </w:r>
+    </w:p>
+    <w:p>
+      <w:pPr>
+        <w:pStyle w:val="Compact"/>
+        <w:numPr>
+          <w:ilvl w:val="0"/>
+          <w:numId w:val="1028"/>
+        </w:numPr>
+      </w:pPr>
+      <w:r>
+        <w:t xml:space="preserve">Simkl keeps only one paused playback per show/movie at a time — resuming a different episode of the same show replaces the previous pause position. This is documented Simkl API behavior, not a Seren limitation.</w:t>
+      </w:r>
+    </w:p>
+    <w:p>
+      <w:r>
+        <w:pict>
+          <v:rect style="width:0;height:1.5pt" o:hralign="center" o:hrstd="t" o:hr="t"/>
+        </w:pict>
+      </w:r>
+    </w:p>
+    <w:bookmarkEnd w:id="144"/>
     <w:bookmarkEnd w:id="145"/>
-    <w:bookmarkStart w:id="146" w:name="enable-disable"/>
+    <w:bookmarkStart w:id="149" w:name="cross-service-sync"/>
+    <w:p>
+      <w:pPr>
+        <w:pStyle w:val="Heading2"/>
+      </w:pPr>
+      <w:r>
+        <w:t xml:space="preserve">18. Cross-Service Sync</w:t>
+      </w:r>
+    </w:p>
+    <w:p>
+      <w:pPr>
+        <w:pStyle w:val="FirstParagraph"/>
+      </w:pPr>
+      <w:r>
+        <w:t xml:space="preserve">Trakt, MDBList, and Simkl mirror each other automatically once 2 or more are connected — a background bridge that keeps watch status, ratings, watchlist, and collection consistent across whichever services you use, without needing to pick one as</w:t>
+      </w:r>
+      <w:r>
+        <w:t xml:space="preserve"> </w:t>
+      </w:r>
+      <w:r>
+        <w:t xml:space="preserve">“primary.”</w:t>
+      </w:r>
+    </w:p>
+    <w:bookmarkStart w:id="146" w:name="what-it-does"/>
     <w:p>
       <w:pPr>
         <w:pStyle w:val="Heading3"/>
       </w:pPr>
       <w:r>
-        <w:t xml:space="preserve">Enable / Disable</w:t>
-      </w:r>
-    </w:p>
-    <w:p>
-      <w:pPr>
-        <w:pStyle w:val="FirstParagraph"/>
-      </w:pPr>
-      <w:r>
-        <w:rPr>
-          <w:b/>
-          <w:bCs/>
-        </w:rPr>
-        <w:t xml:space="preserve">Settings → Watch Accounts → Enable Cross-Service Sync</w:t>
-      </w:r>
-      <w:r>
-        <w:t xml:space="preserve"> </w:t>
-      </w:r>
-      <w:r>
-        <w:t xml:space="preserve">(default: on). Turning it off stops both the instant push and the background reconciliation; each service continues to sync independently with Seren as normal, they just stop mirroring each other.</w:t>
-      </w:r>
-    </w:p>
-    <w:bookmarkEnd w:id="146"/>
-    <w:bookmarkStart w:id="147" w:name="known-limitations-2"/>
-    <w:p>
-      <w:pPr>
-        <w:pStyle w:val="Heading3"/>
-      </w:pPr>
-      <w:r>
-        <w:t xml:space="preserve">Known Limitations</w:t>
+        <w:t xml:space="preserve">What It Does</w:t>
       </w:r>
     </w:p>
     <w:p>
@@ -15858,7 +15919,17 @@
         </w:numPr>
       </w:pPr>
       <w:r>
-        <w:t xml:space="preserve">Requires 2 or more of Trakt/MDBList/Simkl connected to do anything — with only one service connected, there’s nothing to bridge.</w:t>
+        <w:rPr>
+          <w:b/>
+          <w:bCs/>
+        </w:rPr>
+        <w:t xml:space="preserve">Instant push</w:t>
+      </w:r>
+      <w:r>
+        <w:t xml:space="preserve"> </w:t>
+      </w:r>
+      <w:r>
+        <w:t xml:space="preserve">— marking watched/unwatched, rating, or adding to watchlist/collection from any one service’s context menu (Trakt Manager, MDBList Manager, or Simkl Manager) immediately pushes the same change to the other connected services.</w:t>
       </w:r>
     </w:p>
     <w:p>
@@ -15867,6 +15938,100 @@
         <w:numPr>
           <w:ilvl w:val="0"/>
           <w:numId w:val="1029"/>
+        </w:numPr>
+      </w:pPr>
+      <w:r>
+        <w:rPr>
+          <w:b/>
+          <w:bCs/>
+        </w:rPr>
+        <w:t xml:space="preserve">Background reconciliation</w:t>
+      </w:r>
+      <w:r>
+        <w:t xml:space="preserve"> </w:t>
+      </w:r>
+      <w:r>
+        <w:t xml:space="preserve">— roughly every 15 minutes, a background bridge checks each connected service’s own site/app for changes made directly there (outside Seren) and mirrors them across the others.</w:t>
+      </w:r>
+    </w:p>
+    <w:p>
+      <w:pPr>
+        <w:pStyle w:val="Compact"/>
+        <w:numPr>
+          <w:ilvl w:val="0"/>
+          <w:numId w:val="1029"/>
+        </w:numPr>
+      </w:pPr>
+      <w:r>
+        <w:rPr>
+          <w:b/>
+          <w:bCs/>
+        </w:rPr>
+        <w:t xml:space="preserve">Works without Trakt</w:t>
+      </w:r>
+      <w:r>
+        <w:t xml:space="preserve"> </w:t>
+      </w:r>
+      <w:r>
+        <w:t xml:space="preserve">— the bridge doesn’t require Trakt to be connected; any 2 of the 3 services trigger it.</w:t>
+      </w:r>
+    </w:p>
+    <w:bookmarkEnd w:id="146"/>
+    <w:bookmarkStart w:id="147" w:name="enable-disable"/>
+    <w:p>
+      <w:pPr>
+        <w:pStyle w:val="Heading3"/>
+      </w:pPr>
+      <w:r>
+        <w:t xml:space="preserve">Enable / Disable</w:t>
+      </w:r>
+    </w:p>
+    <w:p>
+      <w:pPr>
+        <w:pStyle w:val="FirstParagraph"/>
+      </w:pPr>
+      <w:r>
+        <w:rPr>
+          <w:b/>
+          <w:bCs/>
+        </w:rPr>
+        <w:t xml:space="preserve">Settings → Watch Accounts → Enable Cross-Service Sync</w:t>
+      </w:r>
+      <w:r>
+        <w:t xml:space="preserve"> </w:t>
+      </w:r>
+      <w:r>
+        <w:t xml:space="preserve">(default: on). Turning it off stops both the instant push and the background reconciliation; each service continues to sync independently with Seren as normal, they just stop mirroring each other.</w:t>
+      </w:r>
+    </w:p>
+    <w:bookmarkEnd w:id="147"/>
+    <w:bookmarkStart w:id="148" w:name="known-limitations-2"/>
+    <w:p>
+      <w:pPr>
+        <w:pStyle w:val="Heading3"/>
+      </w:pPr>
+      <w:r>
+        <w:t xml:space="preserve">Known Limitations</w:t>
+      </w:r>
+    </w:p>
+    <w:p>
+      <w:pPr>
+        <w:pStyle w:val="Compact"/>
+        <w:numPr>
+          <w:ilvl w:val="0"/>
+          <w:numId w:val="1030"/>
+        </w:numPr>
+      </w:pPr>
+      <w:r>
+        <w:t xml:space="preserve">Requires 2 or more of Trakt/MDBList/Simkl connected to do anything — with only one service connected, there’s nothing to bridge.</w:t>
+      </w:r>
+    </w:p>
+    <w:p>
+      <w:pPr>
+        <w:pStyle w:val="Compact"/>
+        <w:numPr>
+          <w:ilvl w:val="0"/>
+          <w:numId w:val="1030"/>
         </w:numPr>
       </w:pPr>
       <w:r>
@@ -15894,9 +16059,9 @@
         </w:pict>
       </w:r>
     </w:p>
-    <w:bookmarkEnd w:id="147"/>
     <w:bookmarkEnd w:id="148"/>
-    <w:bookmarkStart w:id="161" w:name="tools-maintenance"/>
+    <w:bookmarkEnd w:id="149"/>
+    <w:bookmarkStart w:id="162" w:name="tools-maintenance"/>
     <w:p>
       <w:pPr>
         <w:pStyle w:val="Heading2"/>
@@ -15905,7 +16070,7 @@
         <w:t xml:space="preserve">19. Tools &amp; Maintenance</w:t>
       </w:r>
     </w:p>
-    <w:bookmarkStart w:id="149" w:name="backup-restore"/>
+    <w:bookmarkStart w:id="150" w:name="backup-restore"/>
     <w:p>
       <w:pPr>
         <w:pStyle w:val="Heading3"/>
@@ -15948,8 +16113,8 @@
         <w:t xml:space="preserve">loads a previously saved backup.</w:t>
       </w:r>
     </w:p>
-    <w:bookmarkEnd w:id="149"/>
-    <w:bookmarkStart w:id="150" w:name="clean-install"/>
+    <w:bookmarkEnd w:id="150"/>
+    <w:bookmarkStart w:id="151" w:name="clean-install"/>
     <w:p>
       <w:pPr>
         <w:pStyle w:val="Heading3"/>
@@ -15966,8 +16131,8 @@
         <w:t xml:space="preserve">Wipes all Seren data and resets to factory defaults. Use with caution.</w:t>
       </w:r>
     </w:p>
-    <w:bookmarkEnd w:id="150"/>
-    <w:bookmarkStart w:id="151" w:name="maintenance"/>
+    <w:bookmarkEnd w:id="151"/>
+    <w:bookmarkStart w:id="152" w:name="maintenance"/>
     <w:p>
       <w:pPr>
         <w:pStyle w:val="Heading3"/>
@@ -15984,8 +16149,8 @@
         <w:t xml:space="preserve">Runs automatic cleanup tasks: expire old cache records, clean up orphaned data, verify database integrity.</w:t>
       </w:r>
     </w:p>
-    <w:bookmarkEnd w:id="151"/>
-    <w:bookmarkStart w:id="152" w:name="language-invoker-toggle"/>
+    <w:bookmarkEnd w:id="152"/>
+    <w:bookmarkStart w:id="153" w:name="language-invoker-toggle"/>
     <w:p>
       <w:pPr>
         <w:pStyle w:val="Heading3"/>
@@ -16017,8 +16182,8 @@
         <w:t xml:space="preserve">setting. When enabled, Seren runs faster (no Python restart between calls) but requires Kodi restart to apply. Seren preserves this preference across upgrades.</w:t>
       </w:r>
     </w:p>
-    <w:bookmarkEnd w:id="152"/>
-    <w:bookmarkStart w:id="153" w:name="premiumize-transfer-cleanup"/>
+    <w:bookmarkEnd w:id="153"/>
+    <w:bookmarkStart w:id="154" w:name="premiumize-transfer-cleanup"/>
     <w:p>
       <w:pPr>
         <w:pStyle w:val="Heading3"/>
@@ -16035,8 +16200,8 @@
         <w:t xml:space="preserve">Automatically removes completed or failed Premiumize transfers to keep your cloud tidy.</w:t>
       </w:r>
     </w:p>
-    <w:bookmarkEnd w:id="153"/>
-    <w:bookmarkStart w:id="154" w:name="clear-cache-tool"/>
+    <w:bookmarkEnd w:id="154"/>
+    <w:bookmarkStart w:id="155" w:name="clear-cache-tool"/>
     <w:p>
       <w:pPr>
         <w:pStyle w:val="Heading3"/>
@@ -16280,8 +16445,8 @@
         </w:tc>
       </w:tr>
     </w:tbl>
-    <w:bookmarkEnd w:id="154"/>
-    <w:bookmarkStart w:id="155" w:name="sync-tools"/>
+    <w:bookmarkEnd w:id="155"/>
+    <w:bookmarkStart w:id="156" w:name="sync-tools"/>
     <w:p>
       <w:pPr>
         <w:pStyle w:val="Heading3"/>
@@ -16429,8 +16594,8 @@
         </w:tc>
       </w:tr>
     </w:tbl>
-    <w:bookmarkEnd w:id="155"/>
-    <w:bookmarkStart w:id="156" w:name="clear-cache-on-version-upgrade"/>
+    <w:bookmarkEnd w:id="156"/>
+    <w:bookmarkStart w:id="157" w:name="clear-cache-on-version-upgrade"/>
     <w:p>
       <w:pPr>
         <w:pStyle w:val="Heading3"/>
@@ -16494,8 +16659,8 @@
         <w:t xml:space="preserve">) is cleared on version change — your torrent and debrid caches are preserved. When ON, a full silent cache clear plus texture cleanup runs, followed by a brief notification toast. The version stamp always updates regardless of this setting.</w:t>
       </w:r>
     </w:p>
-    <w:bookmarkEnd w:id="156"/>
-    <w:bookmarkStart w:id="157" w:name="clear-all-debrid-transfers"/>
+    <w:bookmarkEnd w:id="157"/>
+    <w:bookmarkStart w:id="158" w:name="clear-all-debrid-transfers"/>
     <w:p>
       <w:pPr>
         <w:pStyle w:val="Heading3"/>
@@ -16512,8 +16677,8 @@
         <w:t xml:space="preserve">Removes all active transfers from all connected debrid services.</w:t>
       </w:r>
     </w:p>
-    <w:bookmarkEnd w:id="157"/>
-    <w:bookmarkStart w:id="158" w:name="clear-all-debrid-cloud-files"/>
+    <w:bookmarkEnd w:id="158"/>
+    <w:bookmarkStart w:id="159" w:name="clear-all-debrid-cloud-files"/>
     <w:p>
       <w:pPr>
         <w:pStyle w:val="Heading3"/>
@@ -16530,8 +16695,8 @@
         <w:t xml:space="preserve">Removes all stored files from all debrid cloud storage.</w:t>
       </w:r>
     </w:p>
-    <w:bookmarkEnd w:id="158"/>
-    <w:bookmarkStart w:id="159" w:name="timezone-management"/>
+    <w:bookmarkEnd w:id="159"/>
+    <w:bookmarkStart w:id="160" w:name="timezone-management"/>
     <w:p>
       <w:pPr>
         <w:pStyle w:val="Heading3"/>
@@ -16548,8 +16713,8 @@
         <w:t xml:space="preserve">If your system timezone is wrong, manually choose a timezone from a searchable list.</w:t>
       </w:r>
     </w:p>
-    <w:bookmarkEnd w:id="159"/>
-    <w:bookmarkStart w:id="160" w:name="test-windows"/>
+    <w:bookmarkEnd w:id="160"/>
+    <w:bookmarkStart w:id="161" w:name="test-windows"/>
     <w:p>
       <w:pPr>
         <w:pStyle w:val="Heading3"/>
@@ -16573,9 +16738,9 @@
         </w:pict>
       </w:r>
     </w:p>
-    <w:bookmarkEnd w:id="160"/>
     <w:bookmarkEnd w:id="161"/>
-    <w:bookmarkStart w:id="173" w:name="settings-reference-plain-language"/>
+    <w:bookmarkEnd w:id="162"/>
+    <w:bookmarkStart w:id="174" w:name="settings-reference-plain-language"/>
     <w:p>
       <w:pPr>
         <w:pStyle w:val="Heading2"/>
@@ -16584,7 +16749,7 @@
         <w:t xml:space="preserve">20. Settings Reference (Plain Language)</w:t>
       </w:r>
     </w:p>
-    <w:bookmarkStart w:id="162" w:name="general"/>
+    <w:bookmarkStart w:id="163" w:name="general"/>
     <w:p>
       <w:pPr>
         <w:pStyle w:val="Heading3"/>
@@ -16810,8 +16975,8 @@
         </w:tc>
       </w:tr>
     </w:tbl>
-    <w:bookmarkEnd w:id="162"/>
-    <w:bookmarkStart w:id="163" w:name="scraping"/>
+    <w:bookmarkEnd w:id="163"/>
+    <w:bookmarkStart w:id="164" w:name="scraping"/>
     <w:p>
       <w:pPr>
         <w:pStyle w:val="Heading3"/>
@@ -16965,8 +17130,8 @@
         </w:tc>
       </w:tr>
     </w:tbl>
-    <w:bookmarkEnd w:id="163"/>
-    <w:bookmarkStart w:id="164" w:name="filters"/>
+    <w:bookmarkEnd w:id="164"/>
+    <w:bookmarkStart w:id="165" w:name="filters"/>
     <w:p>
       <w:pPr>
         <w:pStyle w:val="Heading3"/>
@@ -17216,8 +17381,8 @@
         </w:tc>
       </w:tr>
     </w:tbl>
-    <w:bookmarkEnd w:id="164"/>
-    <w:bookmarkStart w:id="165" w:name="sorting"/>
+    <w:bookmarkEnd w:id="165"/>
+    <w:bookmarkStart w:id="166" w:name="sorting"/>
     <w:p>
       <w:pPr>
         <w:pStyle w:val="Heading3"/>
@@ -17323,8 +17488,8 @@
         </w:tc>
       </w:tr>
     </w:tbl>
-    <w:bookmarkEnd w:id="165"/>
-    <w:bookmarkStart w:id="166" w:name="providers"/>
+    <w:bookmarkEnd w:id="166"/>
+    <w:bookmarkStart w:id="167" w:name="providers"/>
     <w:p>
       <w:pPr>
         <w:pStyle w:val="Heading3"/>
@@ -17502,8 +17667,8 @@
         </w:tc>
       </w:tr>
     </w:tbl>
-    <w:bookmarkEnd w:id="166"/>
-    <w:bookmarkStart w:id="167" w:name="playback"/>
+    <w:bookmarkEnd w:id="167"/>
+    <w:bookmarkStart w:id="168" w:name="playback"/>
     <w:p>
       <w:pPr>
         <w:pStyle w:val="Heading3"/>
@@ -17681,8 +17846,8 @@
         </w:tc>
       </w:tr>
     </w:tbl>
-    <w:bookmarkEnd w:id="167"/>
-    <w:bookmarkStart w:id="168" w:name="skip-segments"/>
+    <w:bookmarkEnd w:id="168"/>
+    <w:bookmarkStart w:id="169" w:name="skip-segments"/>
     <w:p>
       <w:pPr>
         <w:pStyle w:val="Heading3"/>
@@ -17908,8 +18073,8 @@
         </w:tc>
       </w:tr>
     </w:tbl>
-    <w:bookmarkEnd w:id="168"/>
-    <w:bookmarkStart w:id="169" w:name="anime-titles"/>
+    <w:bookmarkEnd w:id="169"/>
+    <w:bookmarkStart w:id="170" w:name="anime-titles"/>
     <w:p>
       <w:pPr>
         <w:pStyle w:val="Heading3"/>
@@ -18063,8 +18228,8 @@
         </w:tc>
       </w:tr>
     </w:tbl>
-    <w:bookmarkEnd w:id="169"/>
-    <w:bookmarkStart w:id="170" w:name="advanced"/>
+    <w:bookmarkEnd w:id="170"/>
+    <w:bookmarkStart w:id="171" w:name="advanced"/>
     <w:p>
       <w:pPr>
         <w:pStyle w:val="Heading3"/>
@@ -18218,8 +18383,8 @@
         </w:tc>
       </w:tr>
     </w:tbl>
-    <w:bookmarkEnd w:id="170"/>
-    <w:bookmarkStart w:id="171" w:name="debrid-accounts"/>
+    <w:bookmarkEnd w:id="171"/>
+    <w:bookmarkStart w:id="172" w:name="debrid-accounts"/>
     <w:p>
       <w:pPr>
         <w:pStyle w:val="Heading3"/>
@@ -18242,8 +18407,8 @@
         <w:t xml:space="preserve">- Premiumize, Real-Debrid, AllDebrid, TorBox, Debrid-Link, AniRena API key</w:t>
       </w:r>
     </w:p>
-    <w:bookmarkEnd w:id="171"/>
-    <w:bookmarkStart w:id="172" w:name="watch-accounts"/>
+    <w:bookmarkEnd w:id="172"/>
+    <w:bookmarkStart w:id="173" w:name="watch-accounts"/>
     <w:p>
       <w:pPr>
         <w:pStyle w:val="Heading3"/>
@@ -18451,9 +18616,9 @@
         </w:pict>
       </w:r>
     </w:p>
-    <w:bookmarkEnd w:id="172"/>
     <w:bookmarkEnd w:id="173"/>
-    <w:bookmarkStart w:id="184" w:name="power-user-appendix"/>
+    <w:bookmarkEnd w:id="174"/>
+    <w:bookmarkStart w:id="185" w:name="power-user-appendix"/>
     <w:p>
       <w:pPr>
         <w:pStyle w:val="Heading2"/>
@@ -18462,7 +18627,7 @@
         <w:t xml:space="preserve">21. Power User Appendix</w:t>
       </w:r>
     </w:p>
-    <w:bookmarkStart w:id="174" w:name="internal-scraping-architecture"/>
+    <w:bookmarkStart w:id="175" w:name="internal-scraping-architecture"/>
     <w:p>
       <w:pPr>
         <w:pStyle w:val="Heading3"/>
@@ -18590,8 +18755,8 @@
         <w:t xml:space="preserve">_finalise_results(): merge, sort, return</w:t>
       </w:r>
     </w:p>
-    <w:bookmarkEnd w:id="174"/>
-    <w:bookmarkStart w:id="175" w:name="all-tier-sweep-implementation"/>
+    <w:bookmarkEnd w:id="175"/>
+    <w:bookmarkStart w:id="176" w:name="all-tier-sweep-implementation"/>
     <w:p>
       <w:pPr>
         <w:pStyle w:val="Heading3"/>
@@ -18761,8 +18926,8 @@
         <w:t xml:space="preserve">function captures its Event as a default arg to avoid closure bugs</w:t>
       </w:r>
     </w:p>
-    <w:bookmarkEnd w:id="175"/>
-    <w:bookmarkStart w:id="176" w:name="external-cache-check-logic"/>
+    <w:bookmarkEnd w:id="176"/>
+    <w:bookmarkStart w:id="177" w:name="external-cache-check-logic"/>
     <w:p>
       <w:pPr>
         <w:pStyle w:val="Heading3"/>
@@ -19034,8 +19199,8 @@
         <w:t xml:space="preserve">only)</w:t>
       </w:r>
     </w:p>
-    <w:bookmarkEnd w:id="176"/>
-    <w:bookmarkStart w:id="177" w:name="X9e1a6e9622594987feb3ee6e068499d69ee8f07"/>
+    <w:bookmarkEnd w:id="177"/>
+    <w:bookmarkStart w:id="178" w:name="X9e1a6e9622594987feb3ee6e068499d69ee8f07"/>
     <w:p>
       <w:pPr>
         <w:pStyle w:val="Heading3"/>
@@ -21038,8 +21203,8 @@
         </w:tc>
       </w:tr>
     </w:tbl>
-    <w:bookmarkEnd w:id="177"/>
-    <w:bookmarkStart w:id="178" w:name="scraper_tiers-dictionary"/>
+    <w:bookmarkEnd w:id="178"/>
+    <w:bookmarkStart w:id="179" w:name="scraper_tiers-dictionary"/>
     <w:p>
       <w:pPr>
         <w:pStyle w:val="Heading3"/>
@@ -22020,8 +22185,8 @@
         <w:t xml:space="preserve">prevents AIOStreams from running as a direct scraper (it is used only as an external cache checker).</w:t>
       </w:r>
     </w:p>
-    <w:bookmarkEnd w:id="178"/>
-    <w:bookmarkStart w:id="179" w:name="curl_cffi-integration-in-a4kscrapers"/>
+    <w:bookmarkEnd w:id="179"/>
+    <w:bookmarkStart w:id="180" w:name="curl_cffi-integration-in-a4kscrapers"/>
     <w:p>
       <w:pPr>
         <w:pStyle w:val="Heading3"/>
@@ -22336,8 +22501,8 @@
         <w:t xml:space="preserve">impersonation replicates Chrome 120’s exact TLS ClientHello, JA3 fingerprint, and HTTP/2 ALPN negotiation — indistinguishable from a real browser at the network level. This bypasses Cloudflare’s bot score without needing JavaScript execution or CAPTCHA solving.</w:t>
       </w:r>
     </w:p>
-    <w:bookmarkEnd w:id="179"/>
-    <w:bookmarkStart w:id="180" w:name="database-files"/>
+    <w:bookmarkEnd w:id="180"/>
+    <w:bookmarkStart w:id="181" w:name="database-files"/>
     <w:p>
       <w:pPr>
         <w:pStyle w:val="Heading3"/>
@@ -22868,8 +23033,8 @@
         </w:tc>
       </w:tr>
     </w:tbl>
-    <w:bookmarkEnd w:id="180"/>
-    <w:bookmarkStart w:id="181" w:name="circuit-breaker-per-domain"/>
+    <w:bookmarkEnd w:id="181"/>
+    <w:bookmarkStart w:id="182" w:name="circuit-breaker-per-domain"/>
     <w:p>
       <w:pPr>
         <w:pStyle w:val="Heading3"/>
@@ -22930,8 +23095,8 @@
         <w:t xml:space="preserve">This means a completely dead provider (e.g. a tracker that’s down) returns near-instantly instead of timing out.</w:t>
       </w:r>
     </w:p>
-    <w:bookmarkEnd w:id="181"/>
-    <w:bookmarkStart w:id="182" w:name="provider-performance-scoring"/>
+    <w:bookmarkEnd w:id="182"/>
+    <w:bookmarkStart w:id="183" w:name="provider-performance-scoring"/>
     <w:p>
       <w:pPr>
         <w:pStyle w:val="Heading3"/>
@@ -22963,8 +23128,8 @@
         <w:t xml:space="preserve">Providers with ≥ 3 consecutive failures are demoted. Providers with ≥ 5 consecutive failures are disabled.</w:t>
       </w:r>
     </w:p>
-    <w:bookmarkEnd w:id="182"/>
-    <w:bookmarkStart w:id="183" w:name="sentinel-system-keep-alive"/>
+    <w:bookmarkEnd w:id="183"/>
+    <w:bookmarkStart w:id="184" w:name="sentinel-system-keep-alive"/>
     <w:p>
       <w:pPr>
         <w:pStyle w:val="Heading3"/>
@@ -23041,9 +23206,9 @@
         <w:t xml:space="preserve">Guide date: 2026-07-26</w:t>
       </w:r>
     </w:p>
-    <w:bookmarkEnd w:id="183"/>
     <w:bookmarkEnd w:id="184"/>
     <w:bookmarkEnd w:id="185"/>
+    <w:bookmarkEnd w:id="186"/>
     <w:sectPr>
       <w:pgSz w:h="15840" w:w="12240"/>
       <w:pgMar w:bottom="1134" w:footer="720" w:gutter="0" w:header="720" w:left="1417" w:right="1417" w:top="1134"/>
@@ -23713,7 +23878,34 @@
     </w:lvlOverride>
   </w:num>
   <w:num w:numId="1012">
-    <w:abstractNumId w:val="991"/>
+    <w:abstractNumId w:val="99411"/>
+    <w:lvlOverride w:ilvl="0">
+      <w:startOverride w:val="1"/>
+    </w:lvlOverride>
+    <w:lvlOverride w:ilvl="1">
+      <w:startOverride w:val="1"/>
+    </w:lvlOverride>
+    <w:lvlOverride w:ilvl="2">
+      <w:startOverride w:val="1"/>
+    </w:lvlOverride>
+    <w:lvlOverride w:ilvl="3">
+      <w:startOverride w:val="1"/>
+    </w:lvlOverride>
+    <w:lvlOverride w:ilvl="4">
+      <w:startOverride w:val="1"/>
+    </w:lvlOverride>
+    <w:lvlOverride w:ilvl="5">
+      <w:startOverride w:val="1"/>
+    </w:lvlOverride>
+    <w:lvlOverride w:ilvl="6">
+      <w:startOverride w:val="1"/>
+    </w:lvlOverride>
+    <w:lvlOverride w:ilvl="7">
+      <w:startOverride w:val="1"/>
+    </w:lvlOverride>
+    <w:lvlOverride w:ilvl="8">
+      <w:startOverride w:val="1"/>
+    </w:lvlOverride>
   </w:num>
   <w:num w:numId="1013">
     <w:abstractNumId w:val="991"/>
@@ -23764,6 +23956,9 @@
     <w:abstractNumId w:val="991"/>
   </w:num>
   <w:num w:numId="1029">
+    <w:abstractNumId w:val="991"/>
+  </w:num>
+  <w:num w:numId="1030">
     <w:abstractNumId w:val="991"/>
   </w:num>
 </w:numbering>

</xml_diff>

<commit_message>
Release Seren 3.3.260 — change new-install defaults
Bumps Seren to 3.3.260 and adds changelog entries. Adjusts new-install/profile defaults for several features (Trakt and Cross-Sync now default off; Orion and Easynews providers default off; Auto Caching and Preemptive Termination default off; Scrape All Tiers default on; Preemptive wait-for-cloudfiles default on; MediaFusion default set to Real-Debrid). Code updated so runtime checks use the new default values where appropriate (menus, sync, player, scraping, cross-sync/bridge). Updated repo zips, addons.xml/md5 and added plugin.video.seren-3.3.260.zip. Existing user settings are preserved; these defaults only affect new installs/profiles.
</commit_message>
<xml_diff>
--- a/Seren_3.3.256_User_Guide.docx
+++ b/Seren_3.3.256_User_Guide.docx
@@ -631,11 +631,9 @@
         <w:tc>
           <w:tcPr/>
           <w:p>
-            <w:pPr>
-              <w:pStyle w:val="Compact"/>
-            </w:pPr>
-            <w:r>
-              <w:t xml:space="preserve">a4kScrapers 2.99.127 (included — install from zip)</w:t>
+            <w:r/>
+            <w:r>
+              <w:t>a4kScrapers 2.99.127 (install via Seren's provider-package manager — see Section 5, Step 3)</w:t>
             </w:r>
           </w:p>
         </w:tc>
@@ -4056,7 +4054,8 @@
         <w:pStyle w:val="Heading3"/>
       </w:pPr>
       <w:r>
-        <w:t xml:space="preserve">Step 3 — Install a4kScrapers 2.99.127</w:t>
+        <w:rPr/>
+        <w:t>Step 3 — Install Provider Packages: a4kScrapers, EasyNews, Orion</w:t>
       </w:r>
     </w:p>
     <w:p>
@@ -4068,48 +4067,156 @@
         </w:numPr>
       </w:pPr>
       <w:r>
-        <w:t xml:space="preserve">In Seren, go to</w:t>
-      </w:r>
-      <w:r>
-        <w:t xml:space="preserve"> </w:t>
-      </w:r>
-      <w:r>
         <w:rPr>
           <w:b/>
-          <w:bCs/>
-        </w:rPr>
-        <w:t xml:space="preserve">Settings → Providers → Manage Providers → Install Provider Package</w:t>
-      </w:r>
-      <w:r>
-        <w:t xml:space="preserve">.</w:t>
-      </w:r>
-    </w:p>
-    <w:p>
-      <w:pPr>
-        <w:pStyle w:val="Compact"/>
-        <w:numPr>
-          <w:ilvl w:val="0"/>
-          <w:numId w:val="1010"/>
-        </w:numPr>
-      </w:pPr>
-      <w:r>
-        <w:t xml:space="preserve">Select</w:t>
-      </w:r>
-      <w:r>
-        <w:t xml:space="preserve"> </w:t>
+        </w:rPr>
+        <w:t>a4kScrapers</w:t>
+      </w:r>
+      <w:r>
+        <w:rPr/>
+        <w:t xml:space="preserve">, </w:t>
       </w:r>
       <w:r>
         <w:rPr>
           <w:b/>
-          <w:bCs/>
-        </w:rPr>
-        <w:t xml:space="preserve">a4kScrapers</w:t>
-      </w:r>
-      <w:r>
-        <w:t xml:space="preserve"> </w:t>
-      </w:r>
-      <w:r>
-        <w:t xml:space="preserve">from the list and install it. Seren’s package manager pulls the correct version automatically.</w:t>
+        </w:rPr>
+        <w:t>EasyNews</w:t>
+      </w:r>
+      <w:r>
+        <w:rPr/>
+        <w:t xml:space="preserve"> (</w:t>
+      </w:r>
+      <w:r>
+        <w:rPr>
+          <w:b/>
+        </w:rPr>
+        <w:t>a4kNewsgroups</w:t>
+      </w:r>
+      <w:r>
+        <w:rPr/>
+        <w:t xml:space="preserve">), and </w:t>
+      </w:r>
+      <w:r>
+        <w:rPr>
+          <w:b/>
+        </w:rPr>
+        <w:t>Orion</w:t>
+      </w:r>
+      <w:r>
+        <w:rPr/>
+        <w:t xml:space="preserve"> are Seren provider packages, not Kodi add-ons — they never appear in Kodi’s Add-ons browser. Seren installs and updates them entirely on its own, through its own provider-manager screen.</w:t>
+      </w:r>
+    </w:p>
+    <w:p>
+      <w:pPr/>
+      <w:r>
+        <w:rPr/>
+        <w:t xml:space="preserve">1. In Seren, go to </w:t>
+      </w:r>
+      <w:r>
+        <w:rPr>
+          <w:b/>
+        </w:rPr>
+        <w:t>Tools → Provider Tools → Manage Provider Packages → Install Package</w:t>
+      </w:r>
+      <w:r>
+        <w:rPr/>
+        <w:t>.</w:t>
+      </w:r>
+    </w:p>
+    <w:p>
+      <w:pPr/>
+      <w:r>
+        <w:rPr/>
+        <w:t xml:space="preserve">2. Choose </w:t>
+      </w:r>
+      <w:r>
+        <w:rPr>
+          <w:b/>
+        </w:rPr>
+        <w:t>Web Location...</w:t>
+      </w:r>
+      <w:r>
+        <w:rPr/>
+        <w:t xml:space="preserve"> — this opens Seren’s “Enter Zip URL” prompt.</w:t>
+      </w:r>
+    </w:p>
+    <w:p>
+      <w:pPr/>
+      <w:r>
+        <w:rPr/>
+        <w:t>3. Paste one of the URLs below, confirm, then repeat steps 1–3 for each remaining package.</w:t>
+      </w:r>
+    </w:p>
+    <w:p>
+      <w:pPr/>
+      <w:r>
+        <w:rPr>
+          <w:b/>
+        </w:rPr>
+        <w:t>a4kScrapers</w:t>
+      </w:r>
+      <w:r>
+        <w:rPr/>
+        <w:t>: https://raw.githubusercontent.com/minhgi/repository.seren-scrapers/main/repo/zips/a4kScrapers/a4kScrapers-2.99.127.zip</w:t>
+      </w:r>
+    </w:p>
+    <w:p>
+      <w:pPr/>
+      <w:r>
+        <w:rPr>
+          <w:b/>
+        </w:rPr>
+        <w:t>EasyNews (a4kNewsgroups)</w:t>
+      </w:r>
+      <w:r>
+        <w:rPr/>
+        <w:t>: https://raw.githubusercontent.com/minhgi/repository.seren-scrapers/main/repo/zips/a4kNewsgroups/a4kNewsgroups-1.4.9.zip</w:t>
+      </w:r>
+    </w:p>
+    <w:p>
+      <w:pPr/>
+      <w:r>
+        <w:rPr>
+          <w:b/>
+        </w:rPr>
+        <w:t>Orion</w:t>
+      </w:r>
+      <w:r>
+        <w:rPr/>
+        <w:t>: https://raw.githubusercontent.com/minhgi/repository.seren-scrapers/main/repo/zips/Orion/Orion-5.0.1.zip</w:t>
+      </w:r>
+    </w:p>
+    <w:p>
+      <w:pPr>
+        <w:pStyle w:val="BodyText"/>
+      </w:pPr>
+      <w:r>
+        <w:rPr>
+          <w:b/>
+        </w:rPr>
+        <w:t>EasyNews needs credentials before it’ll return anything.</w:t>
+      </w:r>
+      <w:r>
+        <w:rPr/>
+        <w:t xml:space="preserve"> Back in Manage Provider Packages, select a4kNewsgroups → </w:t>
+      </w:r>
+      <w:r>
+        <w:rPr>
+          <w:b/>
+        </w:rPr>
+        <w:t>Configure Package</w:t>
+      </w:r>
+      <w:r>
+        <w:rPr/>
+        <w:t xml:space="preserve"> → enter your EasyNews username/password. a4kScrapers and Orion don’t need this step.</w:t>
+      </w:r>
+    </w:p>
+    <w:p>
+      <w:pPr/>
+      <w:r>
+        <w:rPr/>
+        <w:t>Once installed, Seren checks each package’s version on its own maintenance cycle and re-downloads automatically when a version goes up — no need to repeat these steps for future updates.</w:t>
       </w:r>
     </w:p>
     <w:bookmarkEnd w:id="37"/>
@@ -4468,7 +4575,7 @@
         <w:t xml:space="preserve"> </w:t>
       </w:r>
       <w:r>
-        <w:t xml:space="preserve">step above fails or behaves oddly, install Seren 3.0.62 from Kodi’s official Add-on repository first, then retry. Step 3 of the main install flow (a4kScrapers) is unaffected either way, since it always installs through Seren’s own package manager rather than through this repository.</w:t>
+        <w:t>step above fails or behaves oddly, install Seren 3.0.62 from Kodi’s official Add-on repository first, then retry. Step 3 of the main install flow (the provider packages) is unaffected either way, since they always install through Seren’s own package manager rather than through this repository.</w:t>
       </w:r>
     </w:p>
     <w:bookmarkEnd w:id="39"/>
@@ -5035,31 +5142,141 @@
       </w:pPr>
       <w:r>
         <w:rPr>
-          <w:rStyle w:val="VerbatimChar"/>
-        </w:rPr>
-        <w:t xml:space="preserve">script.module.curl_cffi-0.15.0_cp314_subinterp_fix.zip</w:t>
-      </w:r>
-      <w:r>
-        <w:t xml:space="preserve"> </w:t>
-      </w:r>
-      <w:r>
-        <w:t xml:space="preserve">is an optional Kodi addon that enables</w:t>
-      </w:r>
-      <w:r>
-        <w:t xml:space="preserve"> </w:t>
-      </w:r>
+          <w:b/>
+        </w:rPr>
+        <w:t>script.module.curl_cffi-0.15.0.zip</w:t>
+      </w:r>
+      <w:r>
+        <w:rPr/>
+        <w:t xml:space="preserve"> is an optional Kodi addon that enables </w:t>
+      </w:r>
+      <w:r>
+        <w:rPr>
+          <w:b/>
+        </w:rPr>
+        <w:t>Chrome-level TLS fingerprint impersonation</w:t>
+      </w:r>
+      <w:r>
+        <w:rPr/>
+        <w:t xml:space="preserve"> via libcurl. When installed, a4kScrapers uses it to bypass Cloudflare bot protection on scraper sites, improving hit rates on sites like Bitsearch, Knaben, and 1337x. Confirmed working on Kodi 22 with Python 3.14.3 — this build already includes a fix for a CPython 3.14 sub-interpreter regression introduced in Python 3.14.3, resolved via a Win32 LoadLibraryExW fallback in _cffi_include.h.</w:t>
+      </w:r>
+    </w:p>
+    <w:p>
+      <w:pPr>
+        <w:pStyle w:val="BodyText"/>
+      </w:pPr>
       <w:r>
         <w:rPr>
           <w:b/>
           <w:bCs/>
         </w:rPr>
-        <w:t xml:space="preserve">Chrome-level TLS fingerprint impersonation</w:t>
-      </w:r>
-      <w:r>
-        <w:t xml:space="preserve"> </w:t>
-      </w:r>
-      <w:r>
-        <w:t xml:space="preserve">via libcurl. When installed, a4kScrapers uses it to bypass Cloudflare bot protection on scraper sites, improving hit rates on sites like Bitsearch, Knaben, and 1337x. Confirmed working on Kodi 22 with Python 3.14.3.</w:t>
+        <w:t xml:space="preserve">This module is optional and only relevant for Kodi 22 (Python 3.13 or 3.14 on Windows x64 / Android ARM64).</w:t>
+      </w:r>
+      <w:r>
+        <w:t xml:space="preserve"> </w:t>
+      </w:r>
+      <w:r>
+        <w:t xml:space="preserve">If not installed, a4kScrapers automatically falls back to the bundled cloudscraper v1.2.60, which handles most sites fine.</w:t>
+      </w:r>
+    </w:p>
+    <w:p>
+      <w:pPr>
+        <w:pStyle w:val="BodyText"/>
+      </w:pPr>
+      <w:r>
+        <w:rPr/>
+        <w:t xml:space="preserve">Unlike Seren/context.seren, curl_cffi is a script module, not a video add-on — it will never appear as a browsable category under </w:t>
+      </w:r>
+      <w:r>
+        <w:rPr>
+          <w:b/>
+        </w:rPr>
+        <w:t>Install from repository</w:t>
+      </w:r>
+      <w:r>
+        <w:rPr/>
+        <w:t>, no matter which repository you browse (Kodi doesn’t generate categories for module-type add-ons). Install it directly instead:</w:t>
+      </w:r>
+    </w:p>
+    <w:p>
+      <w:pPr>
+        <w:pStyle w:val="BodyText"/>
+      </w:pPr>
+      <w:r>
+        <w:rPr/>
+        <w:t xml:space="preserve">1. In Kodi: </w:t>
+      </w:r>
+      <w:r>
+        <w:rPr>
+          <w:b/>
+        </w:rPr>
+        <w:t>Add-ons → Install from zip file</w:t>
+      </w:r>
+      <w:r>
+        <w:rPr/>
+        <w:t xml:space="preserve"> → select script.module.curl_cffi-0.15.0.zip.</w:t>
+      </w:r>
+    </w:p>
+    <w:p>
+      <w:pPr>
+        <w:pStyle w:val="BodyText"/>
+      </w:pPr>
+      <w:r>
+        <w:rPr/>
+        <w:t>2. No configuration required — a4kScrapers detects it automatically at startup.</w:t>
+      </w:r>
+    </w:p>
+    <w:p>
+      <w:pPr>
+        <w:pStyle w:val="BodyText"/>
+      </w:pPr>
+      <w:r>
+        <w:rPr/>
+        <w:t>If installing via the Seren Nixgate repository (see the Alternative box above), the zip is also a direct download from the repository’s own page (https://minhgi.github.io/repository.seren-nixgate/), or paste this exact URL wherever your Kodi build accepts a zip URL:</w:t>
+      </w:r>
+    </w:p>
+    <w:p>
+      <w:pPr>
+        <w:pStyle w:val="BodyText"/>
+      </w:pPr>
+      <w:r>
+        <w:rPr/>
+        <w:t>https://minhgi.github.io/repository.seren-nixgate/repo/zips/script.module.curl_cffi/script.module.curl_cffi-0.15.0.zip</w:t>
+      </w:r>
+    </w:p>
+    <w:bookmarkEnd w:id="45"/>
+    <w:bookmarkStart w:id="46" w:name="Xa49d4023c2e3d13b2eeb9ec3588ce7243065d99"/>
+    <w:p>
+      <w:pPr>
+        <w:pStyle w:val="Heading3"/>
+      </w:pPr>
+      <w:r>
+        <w:t xml:space="preserve">Optional: EasyNews / Usenet Sources (a4kNewsgroups)</w:t>
+      </w:r>
+    </w:p>
+    <w:p>
+      <w:pPr>
+        <w:pStyle w:val="FirstParagraph"/>
+      </w:pPr>
+      <w:r>
+        <w:rPr>
+          <w:b/>
+        </w:rPr>
+        <w:t>a4kNewsgroups</w:t>
+      </w:r>
+      <w:r>
+        <w:rPr/>
+        <w:t xml:space="preserve"> (EasyNews Usenet) adds </w:t>
+      </w:r>
+      <w:r>
+        <w:rPr>
+          <w:b/>
+        </w:rPr>
+        <w:t>EasyNews Usenet</w:t>
+      </w:r>
+      <w:r>
+        <w:rPr/>
+        <w:t xml:space="preserve"> as a direct source provider. Unlike the torrent scrapers, EasyNews delivers files directly from Usenet newsgroups — no debrid service required. It streams directly from EasyNews’s CDN using your account credentials.</w:t>
       </w:r>
     </w:p>
     <w:p>
@@ -5071,13 +5288,13 @@
           <w:b/>
           <w:bCs/>
         </w:rPr>
-        <w:t xml:space="preserve">This module is optional and only relevant for Kodi 22 (Python 3.13 or 3.14 on Windows x64 / Android ARM64).</w:t>
-      </w:r>
-      <w:r>
-        <w:t xml:space="preserve"> </w:t>
-      </w:r>
-      <w:r>
-        <w:t xml:space="preserve">If not installed, a4kScrapers automatically falls back to the bundled cloudscraper v1.2.60, which handles most sites fine.</w:t>
+        <w:t xml:space="preserve">This is optional and requires an active EasyNews subscription</w:t>
+      </w:r>
+      <w:r>
+        <w:t xml:space="preserve"> </w:t>
+      </w:r>
+      <w:r>
+        <w:t xml:space="preserve">(a paid Usenet service — separate from any debrid account).</w:t>
       </w:r>
     </w:p>
     <w:p>
@@ -5085,292 +5302,18 @@
         <w:pStyle w:val="BodyText"/>
       </w:pPr>
       <w:r>
-        <w:t xml:space="preserve">To install:</w:t>
-      </w:r>
-      <w:r>
-        <w:t xml:space="preserve"> </w:t>
-      </w:r>
-      <w:r>
-        <w:t xml:space="preserve">1. In Kodi:</w:t>
-      </w:r>
-      <w:r>
-        <w:t xml:space="preserve"> </w:t>
+        <w:rPr/>
+        <w:t xml:space="preserve">Install it as a provider package, per Step 3 above. After installing, configure credentials: in Seren, </w:t>
       </w:r>
       <w:r>
         <w:rPr>
           <w:b/>
-          <w:bCs/>
-        </w:rPr>
-        <w:t xml:space="preserve">Add-ons → Install from zip file</w:t>
-      </w:r>
-      <w:r>
-        <w:t xml:space="preserve"> </w:t>
-      </w:r>
-      <w:r>
-        <w:t xml:space="preserve">→ select</w:t>
-      </w:r>
-      <w:r>
-        <w:t xml:space="preserve"> </w:t>
-      </w:r>
-      <w:r>
-        <w:rPr>
-          <w:rStyle w:val="VerbatimChar"/>
-        </w:rPr>
-        <w:t xml:space="preserve">script.module.curl_cffi-0.15.0_cp314_subinterp_fix.zip</w:t>
-      </w:r>
-      <w:r>
-        <w:t xml:space="preserve">.</w:t>
-      </w:r>
-      <w:r>
-        <w:t xml:space="preserve"> </w:t>
-      </w:r>
-      <w:r>
-        <w:t xml:space="preserve">2. No configuration required — a4kScrapers detects it automatically at startup.</w:t>
-      </w:r>
-    </w:p>
-    <w:p>
-      <w:pPr>
-        <w:pStyle w:val="BlockText"/>
-      </w:pPr>
-      <w:r>
-        <w:t xml:space="preserve">The</w:t>
-      </w:r>
-      <w:r>
-        <w:t xml:space="preserve"> </w:t>
-      </w:r>
-      <w:r>
-        <w:rPr>
-          <w:rStyle w:val="VerbatimChar"/>
-        </w:rPr>
-        <w:t xml:space="preserve">_cp314_subinterp_fix</w:t>
-      </w:r>
-      <w:r>
-        <w:t xml:space="preserve"> </w:t>
-      </w:r>
-      <w:r>
-        <w:t xml:space="preserve">suffix indicates this build includes a fix for a CPython 3.14 sub-interpreter regression introduced in Python 3.14.3, resolved via a Win32</w:t>
-      </w:r>
-      <w:r>
-        <w:t xml:space="preserve"> </w:t>
-      </w:r>
-      <w:r>
-        <w:rPr>
-          <w:rStyle w:val="VerbatimChar"/>
-        </w:rPr>
-        <w:t xml:space="preserve">LoadLibraryExW</w:t>
-      </w:r>
-      <w:r>
-        <w:t xml:space="preserve"> </w:t>
-      </w:r>
-      <w:r>
-        <w:t xml:space="preserve">fallback in</w:t>
-      </w:r>
-      <w:r>
-        <w:t xml:space="preserve"> </w:t>
-      </w:r>
-      <w:r>
-        <w:rPr>
-          <w:rStyle w:val="VerbatimChar"/>
-        </w:rPr>
-        <w:t xml:space="preserve">_cffi_include.h</w:t>
-      </w:r>
-      <w:r>
-        <w:t xml:space="preserve">. If you are on Kodi 22 with Python 3.14, this specific build is required.</w:t>
-      </w:r>
-    </w:p>
-    <w:bookmarkEnd w:id="45"/>
-    <w:bookmarkStart w:id="46" w:name="Xa49d4023c2e3d13b2eeb9ec3588ce7243065d99"/>
-    <w:p>
-      <w:pPr>
-        <w:pStyle w:val="Heading3"/>
-      </w:pPr>
-      <w:r>
-        <w:t xml:space="preserve">Optional: EasyNews / Usenet Sources (a4kNewsgroups)</w:t>
-      </w:r>
-    </w:p>
-    <w:p>
-      <w:pPr>
-        <w:pStyle w:val="FirstParagraph"/>
-      </w:pPr>
-      <w:r>
-        <w:rPr>
-          <w:rStyle w:val="VerbatimChar"/>
-        </w:rPr>
-        <w:t xml:space="preserve">a4kNewsgroups-1.4.9.zip</w:t>
-      </w:r>
-      <w:r>
-        <w:t xml:space="preserve"> </w:t>
-      </w:r>
-      <w:r>
-        <w:t xml:space="preserve">adds</w:t>
-      </w:r>
-      <w:r>
-        <w:t xml:space="preserve"> </w:t>
-      </w:r>
-      <w:r>
-        <w:rPr>
-          <w:b/>
-          <w:bCs/>
-        </w:rPr>
-        <w:t xml:space="preserve">EasyNews Usenet</w:t>
-      </w:r>
-      <w:r>
-        <w:t xml:space="preserve"> </w:t>
-      </w:r>
-      <w:r>
-        <w:t xml:space="preserve">as a direct source provider. Unlike the torrent scrapers, EasyNews delivers files directly from Usenet newsgroups — no debrid service required. It streams directly from EasyNews’s CDN using your account credentials.</w:t>
-      </w:r>
-    </w:p>
-    <w:p>
-      <w:pPr>
-        <w:pStyle w:val="BodyText"/>
-      </w:pPr>
-      <w:r>
-        <w:rPr>
-          <w:b/>
-          <w:bCs/>
-        </w:rPr>
-        <w:t xml:space="preserve">This is optional and requires an active EasyNews subscription</w:t>
-      </w:r>
-      <w:r>
-        <w:t xml:space="preserve"> </w:t>
-      </w:r>
-      <w:r>
-        <w:t xml:space="preserve">(a paid Usenet service — separate from any debrid account).</w:t>
-      </w:r>
-    </w:p>
-    <w:p>
-      <w:pPr>
-        <w:pStyle w:val="BodyText"/>
-      </w:pPr>
-      <w:r>
-        <w:t xml:space="preserve">To install and configure:</w:t>
-      </w:r>
-      <w:r>
-        <w:t xml:space="preserve"> </w:t>
-      </w:r>
-      <w:r>
-        <w:t xml:space="preserve">1. In Kodi:</w:t>
-      </w:r>
-      <w:r>
-        <w:t xml:space="preserve"> </w:t>
-      </w:r>
-      <w:r>
-        <w:rPr>
-          <w:b/>
-          <w:bCs/>
-        </w:rPr>
-        <w:t xml:space="preserve">Add-ons → Install from zip file</w:t>
-      </w:r>
-      <w:r>
-        <w:t xml:space="preserve"> </w:t>
-      </w:r>
-      <w:r>
-        <w:t xml:space="preserve">→ select</w:t>
-      </w:r>
-      <w:r>
-        <w:t xml:space="preserve"> </w:t>
-      </w:r>
-      <w:r>
-        <w:rPr>
-          <w:rStyle w:val="VerbatimChar"/>
-        </w:rPr>
-        <w:t xml:space="preserve">a4kNewsgroups-1.4.9.zip</w:t>
-      </w:r>
-      <w:r>
-        <w:t xml:space="preserve">.</w:t>
-      </w:r>
-      <w:r>
-        <w:t xml:space="preserve"> </w:t>
-      </w:r>
-      <w:r>
-        <w:t xml:space="preserve">2. After installation, a setup dialog appears asking for your EasyNews</w:t>
-      </w:r>
-      <w:r>
-        <w:t xml:space="preserve"> </w:t>
-      </w:r>
-      <w:r>
-        <w:rPr>
-          <w:b/>
-          <w:bCs/>
-        </w:rPr>
-        <w:t xml:space="preserve">Username</w:t>
-      </w:r>
-      <w:r>
-        <w:t xml:space="preserve"> </w:t>
-      </w:r>
-      <w:r>
-        <w:t xml:space="preserve">and</w:t>
-      </w:r>
-      <w:r>
-        <w:t xml:space="preserve"> </w:t>
-      </w:r>
-      <w:r>
-        <w:rPr>
-          <w:b/>
-          <w:bCs/>
-        </w:rPr>
-        <w:t xml:space="preserve">Password</w:t>
-      </w:r>
-      <w:r>
-        <w:t xml:space="preserve">. Enter them.</w:t>
-      </w:r>
-      <w:r>
-        <w:t xml:space="preserve"> </w:t>
-      </w:r>
-      <w:r>
-        <w:t xml:space="preserve">3. If you skipped the dialog, go to</w:t>
-      </w:r>
-      <w:r>
-        <w:t xml:space="preserve"> </w:t>
-      </w:r>
-      <w:r>
-        <w:rPr>
-          <w:b/>
-          <w:bCs/>
-        </w:rPr>
-        <w:t xml:space="preserve">Settings → Providers → EasyNews (a4kNewsgroups)</w:t>
-      </w:r>
-      <w:r>
-        <w:t xml:space="preserve"> </w:t>
-      </w:r>
-      <w:r>
-        <w:t xml:space="preserve">and enter credentials there.</w:t>
-      </w:r>
-      <w:r>
-        <w:t xml:space="preserve"> </w:t>
-      </w:r>
-      <w:r>
-        <w:t xml:space="preserve">4. Enable/disable EasyNews sources globally via the</w:t>
-      </w:r>
-      <w:r>
-        <w:t xml:space="preserve"> </w:t>
-      </w:r>
-      <w:r>
-        <w:rPr>
-          <w:b/>
-          <w:bCs/>
-        </w:rPr>
-        <w:t xml:space="preserve">Easynews</w:t>
-      </w:r>
-      <w:r>
-        <w:t xml:space="preserve"> </w:t>
-      </w:r>
-      <w:r>
-        <w:t xml:space="preserve">toggle in</w:t>
-      </w:r>
-      <w:r>
-        <w:t xml:space="preserve"> </w:t>
-      </w:r>
-      <w:r>
-        <w:rPr>
-          <w:b/>
-          <w:bCs/>
-        </w:rPr>
-        <w:t xml:space="preserve">Settings → Scraping</w:t>
-      </w:r>
-      <w:r>
-        <w:t xml:space="preserve">.</w:t>
+        </w:rPr>
+        <w:t>Tools → Provider Tools → Manage Provider Packages → select a4kNewsgroups → Configure Package</w:t>
+      </w:r>
+      <w:r>
+        <w:rPr/>
+        <w:t>, then enter your EasyNews Username and Password. Enable/disable EasyNews sources globally via the Easynews toggle in Settings → Scraping.</w:t>
       </w:r>
     </w:p>
     <w:p>
@@ -12218,33 +12161,18 @@
         <w:pStyle w:val="FirstParagraph"/>
       </w:pPr>
       <w:r>
-        <w:t xml:space="preserve">Install a4kScrapers via Seren’s built-in package manager:</w:t>
-      </w:r>
-      <w:r>
-        <w:t xml:space="preserve"> </w:t>
+        <w:rPr/>
+        <w:t xml:space="preserve">Install a4kScrapers, EasyNews (a4kNewsgroups), and Orion via Seren’s built-in package manager: </w:t>
       </w:r>
       <w:r>
         <w:rPr>
           <w:b/>
-          <w:bCs/>
-        </w:rPr>
-        <w:t xml:space="preserve">Settings → Providers → Manage Providers → Install Provider Package</w:t>
-      </w:r>
-      <w:r>
-        <w:t xml:space="preserve">, then select</w:t>
-      </w:r>
-      <w:r>
-        <w:t xml:space="preserve"> </w:t>
-      </w:r>
-      <w:r>
-        <w:rPr>
-          <w:b/>
-          <w:bCs/>
-        </w:rPr>
-        <w:t xml:space="preserve">a4kScrapers</w:t>
-      </w:r>
-      <w:r>
-        <w:t xml:space="preserve">. This is the recommended method — Seren handles the correct version automatically.</w:t>
+        </w:rPr>
+        <w:t>Tools → Provider Tools → Manage Provider Packages → Install Package → Web Location...</w:t>
+      </w:r>
+      <w:r>
+        <w:rPr/>
+        <w:t>, then paste the package’s zip URL. See Section 5, Step 3 for the exact URLs.</w:t>
       </w:r>
     </w:p>
     <w:bookmarkEnd w:id="105"/>

</xml_diff>